<commit_message>
fix: correção completa do cálculo de comportamento (elogio + indisciplina no mesmo dia), sincronização docx, ranking e notificações
</commit_message>
<xml_diff>
--- a/backend/pdf/modelo-notificacao-dinamico.docx
+++ b/backend/pdf/modelo-notificacao-dinamico.docx
@@ -2,88 +2,146 @@
 <file path=word/document.xml><?xml version="1.0" encoding="utf-8"?>
 <w:document xmlns:wpc="http://schemas.microsoft.com/office/word/2010/wordprocessingCanvas" xmlns:cx="http://schemas.microsoft.com/office/drawing/2014/chartex" xmlns:cx1="http://schemas.microsoft.com/office/drawing/2015/9/8/chartex" xmlns:cx2="http://schemas.microsoft.com/office/drawing/2015/10/21/chartex" xmlns:cx3="http://schemas.microsoft.com/office/drawing/2016/5/9/chartex" xmlns:cx4="http://schemas.microsoft.com/office/drawing/2016/5/10/chartex" xmlns:cx5="http://schemas.microsoft.com/office/drawing/2016/5/11/chartex" xmlns:cx6="http://schemas.microsoft.com/office/drawing/2016/5/12/chartex" xmlns:cx7="http://schemas.microsoft.com/office/drawing/2016/5/13/chartex" xmlns:cx8="http://schemas.microsoft.com/office/drawing/2016/5/14/chartex" xmlns:mc="http://schemas.openxmlformats.org/markup-compatibility/2006" xmlns:aink="http://schemas.microsoft.com/office/drawing/2016/ink" xmlns:am3d="http://schemas.microsoft.com/office/drawing/2017/model3d" xmlns:o="urn:schemas-microsoft-com:office:office" xmlns:oel="http://schemas.microsoft.com/office/2019/extlst" xmlns:r="http://schemas.openxmlformats.org/officeDocument/2006/relationships" xmlns:m="http://schemas.openxmlformats.org/officeDocument/2006/math" xmlns:v="urn:schemas-microsoft-com:vml" xmlns:wp14="http://schemas.microsoft.com/office/word/2010/wordprocessingDrawing" xmlns:wp="http://schemas.openxmlformats.org/drawingml/2006/wordprocessingDrawing" xmlns:w10="urn:schemas-microsoft-com:office:word" xmlns:w="http://schemas.openxmlformats.org/wordprocessingml/2006/main" xmlns:w14="http://schemas.microsoft.com/office/word/2010/wordml" xmlns:w15="http://schemas.microsoft.com/office/word/2012/wordml" xmlns:w16cex="http://schemas.microsoft.com/office/word/2018/wordml/cex" xmlns:w16cid="http://schemas.microsoft.com/office/word/2016/wordml/cid" xmlns:w16="http://schemas.microsoft.com/office/word/2018/wordml" xmlns:w16du="http://schemas.microsoft.com/office/word/2023/wordml/word16du" xmlns:w16sdtdh="http://schemas.microsoft.com/office/word/2020/wordml/sdtdatahash" xmlns:w16sdtfl="http://schemas.microsoft.com/office/word/2024/wordml/sdtformatlock" xmlns:w16se="http://schemas.microsoft.com/office/word/2015/wordml/symex" xmlns:wpg="http://schemas.microsoft.com/office/word/2010/wordprocessingGroup" xmlns:wpi="http://schemas.microsoft.com/office/word/2010/wordprocessingInk" xmlns:wne="http://schemas.microsoft.com/office/word/2006/wordml" xmlns:wps="http://schemas.microsoft.com/office/word/2010/wordprocessingShape" mc:Ignorable="w14 w15 w16se w16cid w16 w16cex w16sdtdh w16sdtfl w16du wp14">
   <w:body>
+    <w:p/>
     <w:p>
       <w:pPr>
         <w:jc w:val="center"/>
+        <w:rPr>
+          <w:b/>
+          <w:bCs/>
+        </w:rPr>
       </w:pPr>
       <w:r>
         <w:rPr>
           <w:b/>
-          <w:sz w:val="32"/>
+          <w:bCs/>
         </w:rPr>
-        <w:t>NOTIFICAÇÃO</w:t>
+        <w:t>{{</w:t>
       </w:r>
+      <w:proofErr w:type="spellStart"/>
       <w:r>
         <w:rPr>
           <w:b/>
-          <w:sz w:val="32"/>
+          <w:bCs/>
         </w:rPr>
-        <w:t xml:space="preserve"> DE MEDIDA</w:t>
+        <w:t>tituloDocumento</w:t>
       </w:r>
+      <w:proofErr w:type="spellEnd"/>
       <w:r>
         <w:rPr>
           <w:b/>
-          <w:sz w:val="32"/>
+          <w:bCs/>
         </w:rPr>
-        <w:t xml:space="preserve"> DISCIPLINAR</w:t>
+        <w:t>}}</w:t>
       </w:r>
     </w:p>
     <w:p>
       <w:pPr>
         <w:jc w:val="center"/>
       </w:pPr>
+      <w:proofErr w:type="spellStart"/>
       <w:r>
-        <w:rPr>
-          <w:i/>
-        </w:rPr>
-        <w:t>Notificação nº {{numero</w:t>
+        <w:t>Notificação</w:t>
       </w:r>
+      <w:proofErr w:type="spellEnd"/>
       <w:r>
-        <w:rPr>
-          <w:i/>
-        </w:rPr>
-        <w:t>Sequencial</w:t>
+        <w:t xml:space="preserve"> nº {{</w:t>
       </w:r>
+      <w:proofErr w:type="spellStart"/>
       <w:r>
-        <w:rPr>
-          <w:i/>
-        </w:rPr>
+        <w:t>numeroSequencial</w:t>
+      </w:r>
+      <w:proofErr w:type="spellEnd"/>
+      <w:r>
         <w:t>}}</w:t>
       </w:r>
     </w:p>
     <w:p/>
     <w:p>
+      <w:proofErr w:type="spellStart"/>
       <w:r>
-        <w:t>Aluno: {{aluno}}</w:t>
+        <w:t>Aluno</w:t>
+      </w:r>
+      <w:proofErr w:type="spellEnd"/>
+      <w:r>
+        <w:t>: {{</w:t>
+      </w:r>
+      <w:proofErr w:type="spellStart"/>
+      <w:r>
+        <w:t>aluno</w:t>
+      </w:r>
+      <w:proofErr w:type="spellEnd"/>
+      <w:r>
+        <w:t>}}</w:t>
+      </w:r>
+    </w:p>
+    <w:p>
+      <w:proofErr w:type="spellStart"/>
+      <w:r>
+        <w:t>Turma</w:t>
+      </w:r>
+      <w:proofErr w:type="spellEnd"/>
+      <w:r>
+        <w:t>: {{</w:t>
+      </w:r>
+      <w:proofErr w:type="spellStart"/>
+      <w:r>
+        <w:t>turma</w:t>
+      </w:r>
+      <w:proofErr w:type="spellEnd"/>
+      <w:r>
+        <w:t>}}</w:t>
       </w:r>
     </w:p>
     <w:p>
       <w:r>
-        <w:t>Turma: {{turma}}</w:t>
+        <w:t>Data: {{</w:t>
+      </w:r>
+      <w:proofErr w:type="spellStart"/>
+      <w:r>
+        <w:t>dataHora</w:t>
+      </w:r>
+      <w:proofErr w:type="spellEnd"/>
+      <w:r>
+        <w:t>}}</w:t>
+      </w:r>
+    </w:p>
+    <w:p/>
+    <w:p>
+      <w:proofErr w:type="spellStart"/>
+      <w:r>
+        <w:t>Descrição</w:t>
+      </w:r>
+      <w:proofErr w:type="spellEnd"/>
+      <w:r>
+        <w:t>:</w:t>
       </w:r>
     </w:p>
     <w:p>
       <w:r>
-        <w:t>Data: {{dataHora}}</w:t>
+        <w:t>{{</w:t>
+      </w:r>
+      <w:proofErr w:type="spellStart"/>
+      <w:r>
+        <w:t>descricaoInfracao</w:t>
+      </w:r>
+      <w:proofErr w:type="spellEnd"/>
+      <w:r>
+        <w:t xml:space="preserve">}} </w:t>
       </w:r>
     </w:p>
     <w:p/>
     <w:p>
       <w:r>
-        <w:rPr>
-          <w:b/>
-        </w:rPr>
-        <w:t>Descrição da Infração:</w:t>
+        <w:t>{{</w:t>
       </w:r>
+      <w:proofErr w:type="spellStart"/>
       <w:r>
-        <w:br/>
-        <w:t>{{artigo}} – {{descricaoInciso}}</w:t>
+        <w:t>fraseResultado</w:t>
       </w:r>
-    </w:p>
-    <w:p/>
-    <w:p>
+      <w:proofErr w:type="spellEnd"/>
       <w:r>
-        <w:t>Esta medida acarreta perda de sua nota disciplinar em {{Valor}} pontos, enquadrando-se no comportamento {{comportamento}}.</w:t>
+        <w:t>}}</w:t>
       </w:r>
     </w:p>
     <w:p/>
@@ -117,7 +175,23 @@
                 <w:b/>
                 <w:sz w:val="28"/>
               </w:rPr>
-              <w:t>Nota Anterior: {{notaAnterior}}</w:t>
+              <w:t>Nota Anterior: {{</w:t>
+            </w:r>
+            <w:proofErr w:type="spellStart"/>
+            <w:r>
+              <w:rPr>
+                <w:b/>
+                <w:sz w:val="28"/>
+              </w:rPr>
+              <w:t>notaAnterior</w:t>
+            </w:r>
+            <w:proofErr w:type="spellEnd"/>
+            <w:r>
+              <w:rPr>
+                <w:b/>
+                <w:sz w:val="28"/>
+              </w:rPr>
+              <w:t>}}</w:t>
             </w:r>
             <w:r>
               <w:rPr>
@@ -125,7 +199,39 @@
                 <w:sz w:val="28"/>
               </w:rPr>
               <w:br/>
-              <w:t>Nota Atual: {{notaAtual}}</w:t>
+              <w:t xml:space="preserve">Nota </w:t>
+            </w:r>
+            <w:proofErr w:type="spellStart"/>
+            <w:r>
+              <w:rPr>
+                <w:b/>
+                <w:sz w:val="28"/>
+              </w:rPr>
+              <w:t>Atual</w:t>
+            </w:r>
+            <w:proofErr w:type="spellEnd"/>
+            <w:r>
+              <w:rPr>
+                <w:b/>
+                <w:sz w:val="28"/>
+              </w:rPr>
+              <w:t>: {{</w:t>
+            </w:r>
+            <w:proofErr w:type="spellStart"/>
+            <w:r>
+              <w:rPr>
+                <w:b/>
+                <w:sz w:val="28"/>
+              </w:rPr>
+              <w:t>notaAtual</w:t>
+            </w:r>
+            <w:proofErr w:type="spellEnd"/>
+            <w:r>
+              <w:rPr>
+                <w:b/>
+                <w:sz w:val="28"/>
+              </w:rPr>
+              <w:t>}}</w:t>
             </w:r>
           </w:p>
         </w:tc>
@@ -140,13 +246,41 @@
             </w:tcBorders>
           </w:tcPr>
           <w:p>
+            <w:proofErr w:type="spellStart"/>
             <w:r>
               <w:rPr>
                 <w:b/>
                 <w:bdr w:val="single" w:sz="4" w:space="0" w:color="auto"/>
                 <w:shd w:val="clear" w:color="auto" w:fill="8DB3E2" w:themeFill="text2" w:themeFillTint="66"/>
               </w:rPr>
-              <w:t>Classificação do Comportamento:</w:t>
+              <w:t>Classificação</w:t>
+            </w:r>
+            <w:proofErr w:type="spellEnd"/>
+            <w:r>
+              <w:rPr>
+                <w:b/>
+                <w:bdr w:val="single" w:sz="4" w:space="0" w:color="auto"/>
+                <w:shd w:val="clear" w:color="auto" w:fill="8DB3E2" w:themeFill="text2" w:themeFillTint="66"/>
+              </w:rPr>
+              <w:t xml:space="preserve"> do </w:t>
+            </w:r>
+            <w:proofErr w:type="spellStart"/>
+            <w:r>
+              <w:rPr>
+                <w:b/>
+                <w:bdr w:val="single" w:sz="4" w:space="0" w:color="auto"/>
+                <w:shd w:val="clear" w:color="auto" w:fill="8DB3E2" w:themeFill="text2" w:themeFillTint="66"/>
+              </w:rPr>
+              <w:t>Comportamento</w:t>
+            </w:r>
+            <w:proofErr w:type="spellEnd"/>
+            <w:r>
+              <w:rPr>
+                <w:b/>
+                <w:bdr w:val="single" w:sz="4" w:space="0" w:color="auto"/>
+                <w:shd w:val="clear" w:color="auto" w:fill="8DB3E2" w:themeFill="text2" w:themeFillTint="66"/>
+              </w:rPr>
+              <w:t>:</w:t>
             </w:r>
             <w:r>
               <w:rPr>
@@ -155,15 +289,33 @@
               <w:br/>
             </w:r>
             <w:r>
-              <w:t>9,50 a 10,00 - Excepcional</w:t>
+              <w:t xml:space="preserve">9,50 a 10,00 - </w:t>
             </w:r>
+            <w:proofErr w:type="spellStart"/>
+            <w:r>
+              <w:t>Excepcional</w:t>
+            </w:r>
+            <w:proofErr w:type="spellEnd"/>
             <w:r>
               <w:br/>
-              <w:t>8,50 a 9,49 - Ótimo</w:t>
+              <w:t xml:space="preserve">8,50 a 9,49 - </w:t>
             </w:r>
+            <w:proofErr w:type="spellStart"/>
+            <w:r>
+              <w:t>Ótimo</w:t>
+            </w:r>
+            <w:proofErr w:type="spellEnd"/>
             <w:r>
               <w:br/>
-              <w:t>7,00 a 8,49 - Bom</w:t>
+              <w:t xml:space="preserve">7,00 </w:t>
+            </w:r>
+            <w:proofErr w:type="gramStart"/>
+            <w:r>
+              <w:t>a</w:t>
+            </w:r>
+            <w:proofErr w:type="gramEnd"/>
+            <w:r>
+              <w:t xml:space="preserve"> 8,49 - Bom</w:t>
             </w:r>
             <w:r>
               <w:br/>
@@ -171,38 +323,93 @@
             </w:r>
             <w:r>
               <w:br/>
-              <w:t>3,00 a 4,99 - Insuficiente</w:t>
+              <w:t xml:space="preserve">3,00 a 4,99 - </w:t>
             </w:r>
+            <w:proofErr w:type="spellStart"/>
+            <w:r>
+              <w:t>Insuficiente</w:t>
+            </w:r>
+            <w:proofErr w:type="spellEnd"/>
             <w:r>
               <w:br/>
-              <w:t>0,00 a 2,99 - Incompatível</w:t>
+              <w:t xml:space="preserve">0,00 a 2,99 - </w:t>
             </w:r>
+            <w:proofErr w:type="spellStart"/>
+            <w:r>
+              <w:t>Incompatível</w:t>
+            </w:r>
+            <w:proofErr w:type="spellEnd"/>
           </w:p>
         </w:tc>
       </w:tr>
     </w:tbl>
     <w:p/>
-    <w:p>
-      <w:r>
-        <w:rPr>
-          <w:b/>
-        </w:rPr>
-        <w:t>Observação do Monitor:</w:t>
-      </w:r>
-    </w:p>
-    <w:p>
-      <w:r>
-        <w:t>{{observacao}}</w:t>
-      </w:r>
-    </w:p>
+    <w:p/>
+    <w:p/>
     <w:p/>
     <w:p/>
     <w:p/>
     <w:p/>
     <w:p>
+      <w:proofErr w:type="spellStart"/>
       <w:r>
-        <w:lastRenderedPageBreak/>
-        <w:t>Justificativa do responsável:</w:t>
+        <w:rPr>
+          <w:b/>
+        </w:rPr>
+        <w:t>Observação</w:t>
+      </w:r>
+      <w:proofErr w:type="spellEnd"/>
+      <w:r>
+        <w:rPr>
+          <w:b/>
+        </w:rPr>
+        <w:t xml:space="preserve"> do Monitor:</w:t>
+      </w:r>
+    </w:p>
+    <w:p>
+      <w:r>
+        <w:t>{{</w:t>
+      </w:r>
+      <w:proofErr w:type="spellStart"/>
+      <w:r>
+        <w:t>observacao</w:t>
+      </w:r>
+      <w:proofErr w:type="spellEnd"/>
+      <w:r>
+        <w:t>}}</w:t>
+      </w:r>
+    </w:p>
+    <w:p/>
+    <w:p>
+      <w:r>
+        <w:t>{{</w:t>
+      </w:r>
+      <w:proofErr w:type="spellStart"/>
+      <w:r>
+        <w:t>fraseFinal</w:t>
+      </w:r>
+      <w:proofErr w:type="spellEnd"/>
+      <w:r>
+        <w:t>}}</w:t>
+      </w:r>
+    </w:p>
+    <w:p/>
+    <w:p>
+      <w:proofErr w:type="spellStart"/>
+      <w:r>
+        <w:t>Justificativa</w:t>
+      </w:r>
+      <w:proofErr w:type="spellEnd"/>
+      <w:r>
+        <w:t xml:space="preserve"> do </w:t>
+      </w:r>
+      <w:proofErr w:type="spellStart"/>
+      <w:r>
+        <w:t>responsável</w:t>
+      </w:r>
+      <w:proofErr w:type="spellEnd"/>
+      <w:r>
+        <w:t>:</w:t>
       </w:r>
     </w:p>
     <w:p>
@@ -244,9 +451,19 @@
       <w:pPr>
         <w:jc w:val="center"/>
       </w:pPr>
+      <w:proofErr w:type="spellStart"/>
       <w:r>
-        <w:t>Assinatura do responsável</w:t>
+        <w:t>Assinatura</w:t>
       </w:r>
+      <w:proofErr w:type="spellEnd"/>
+      <w:r>
+        <w:t xml:space="preserve"> do </w:t>
+      </w:r>
+      <w:proofErr w:type="spellStart"/>
+      <w:r>
+        <w:t>responsável</w:t>
+      </w:r>
+      <w:proofErr w:type="spellEnd"/>
     </w:p>
     <w:p>
       <w:pPr>
@@ -266,11 +483,23 @@
         <w:jc w:val="center"/>
       </w:pPr>
       <w:r>
-        <w:t>3ºSGT BM Helder Freire da Silva</w:t>
+        <w:br/>
       </w:r>
+      <w:proofErr w:type="spellStart"/>
       <w:r>
-        <w:br/>
-        <w:t>Coordenador do Corpo de Alunos do CMDP II-CZS</w:t>
+        <w:t>Coordenador</w:t>
+      </w:r>
+      <w:proofErr w:type="spellEnd"/>
+      <w:r>
+        <w:t xml:space="preserve"> do Corpo de </w:t>
+      </w:r>
+      <w:proofErr w:type="spellStart"/>
+      <w:r>
+        <w:t>Alunos</w:t>
+      </w:r>
+      <w:proofErr w:type="spellEnd"/>
+      <w:r>
+        <w:t xml:space="preserve"> do CMDP II-CZS</w:t>
       </w:r>
     </w:p>
     <w:p/>
@@ -279,7 +508,15 @@
         <w:ind w:firstLine="3544"/>
       </w:pPr>
       <w:r>
-        <w:t>Cruzeiro do Sul – AC, {{dataHora}}</w:t>
+        <w:t>Cruzeiro do Sul – AC, {{</w:t>
+      </w:r>
+      <w:proofErr w:type="spellStart"/>
+      <w:r>
+        <w:t>dataHora</w:t>
+      </w:r>
+      <w:proofErr w:type="spellEnd"/>
+      <w:r>
+        <w:t>}}</w:t>
       </w:r>
     </w:p>
     <w:p/>

</xml_diff>

<commit_message>
feat: nova arquitetura de notificacoes com separacao por modo (ativas, pendentes, arquivadas e antigas)
- Implementa filtro por modo no backend (principal, pendentes, arquivadas, antigas)
- Adiciona separacao por data (>=2026 fluxo novo | <2026 historico)
- Cria aba 'Notificacoes Antigas' no frontend
- Ajusta carregamento com paginacao completa (loop de paginas)
- Corrige duplicidade entre ativas e arquivadas
- Implementa logica correta de devolucao (devolvidoPeloAluno + arquivada)
- Mantem integracao com TSMD e recalculo de notas
- Atualiza templates PDF e DOCX dinamicos
- Adiciona configuracao disciplinar multi-tenant
- Ajustes gerais de frontend e performance
</commit_message>
<xml_diff>
--- a/backend/pdf/modelo-notificacao-dinamico.docx
+++ b/backend/pdf/modelo-notificacao-dinamico.docx
@@ -2,480 +2,16 @@
 <file path=word/document.xml><?xml version="1.0" encoding="utf-8"?>
 <w:document xmlns:wpc="http://schemas.microsoft.com/office/word/2010/wordprocessingCanvas" xmlns:cx="http://schemas.microsoft.com/office/drawing/2014/chartex" xmlns:cx1="http://schemas.microsoft.com/office/drawing/2015/9/8/chartex" xmlns:cx2="http://schemas.microsoft.com/office/drawing/2015/10/21/chartex" xmlns:cx3="http://schemas.microsoft.com/office/drawing/2016/5/9/chartex" xmlns:cx4="http://schemas.microsoft.com/office/drawing/2016/5/10/chartex" xmlns:cx5="http://schemas.microsoft.com/office/drawing/2016/5/11/chartex" xmlns:cx6="http://schemas.microsoft.com/office/drawing/2016/5/12/chartex" xmlns:cx7="http://schemas.microsoft.com/office/drawing/2016/5/13/chartex" xmlns:cx8="http://schemas.microsoft.com/office/drawing/2016/5/14/chartex" xmlns:mc="http://schemas.openxmlformats.org/markup-compatibility/2006" xmlns:aink="http://schemas.microsoft.com/office/drawing/2016/ink" xmlns:am3d="http://schemas.microsoft.com/office/drawing/2017/model3d" xmlns:o="urn:schemas-microsoft-com:office:office" xmlns:oel="http://schemas.microsoft.com/office/2019/extlst" xmlns:r="http://schemas.openxmlformats.org/officeDocument/2006/relationships" xmlns:m="http://schemas.openxmlformats.org/officeDocument/2006/math" xmlns:v="urn:schemas-microsoft-com:vml" xmlns:wp14="http://schemas.microsoft.com/office/word/2010/wordprocessingDrawing" xmlns:wp="http://schemas.openxmlformats.org/drawingml/2006/wordprocessingDrawing" xmlns:w10="urn:schemas-microsoft-com:office:word" xmlns:w="http://schemas.openxmlformats.org/wordprocessingml/2006/main" xmlns:w14="http://schemas.microsoft.com/office/word/2010/wordml" xmlns:w15="http://schemas.microsoft.com/office/word/2012/wordml" xmlns:w16cex="http://schemas.microsoft.com/office/word/2018/wordml/cex" xmlns:w16cid="http://schemas.microsoft.com/office/word/2016/wordml/cid" xmlns:w16="http://schemas.microsoft.com/office/word/2018/wordml" xmlns:w16du="http://schemas.microsoft.com/office/word/2023/wordml/word16du" xmlns:w16sdtdh="http://schemas.microsoft.com/office/word/2020/wordml/sdtdatahash" xmlns:w16sdtfl="http://schemas.microsoft.com/office/word/2024/wordml/sdtformatlock" xmlns:w16se="http://schemas.microsoft.com/office/word/2015/wordml/symex" xmlns:wpg="http://schemas.microsoft.com/office/word/2010/wordprocessingGroup" xmlns:wpi="http://schemas.microsoft.com/office/word/2010/wordprocessingInk" xmlns:wne="http://schemas.microsoft.com/office/word/2006/wordml" xmlns:wps="http://schemas.microsoft.com/office/word/2010/wordprocessingShape" mc:Ignorable="w14 w15 w16se w16cid w16 w16cex w16sdtdh w16sdtfl w16du wp14">
   <w:body>
-    <w:p/>
-    <w:p>
-      <w:pPr>
-        <w:jc w:val="center"/>
-        <w:rPr>
-          <w:b/>
-          <w:bCs/>
-        </w:rPr>
-      </w:pPr>
-      <w:r>
-        <w:rPr>
-          <w:b/>
-          <w:bCs/>
-        </w:rPr>
-        <w:t>{{</w:t>
-      </w:r>
-      <w:proofErr w:type="spellStart"/>
-      <w:r>
-        <w:rPr>
-          <w:b/>
-          <w:bCs/>
-        </w:rPr>
-        <w:t>tituloDocumento</w:t>
-      </w:r>
-      <w:proofErr w:type="spellEnd"/>
-      <w:r>
-        <w:rPr>
-          <w:b/>
-          <w:bCs/>
-        </w:rPr>
-        <w:t>}}</w:t>
-      </w:r>
-    </w:p>
-    <w:p>
-      <w:pPr>
-        <w:jc w:val="center"/>
-      </w:pPr>
-      <w:proofErr w:type="spellStart"/>
-      <w:r>
-        <w:t>Notificação</w:t>
-      </w:r>
-      <w:proofErr w:type="spellEnd"/>
-      <w:r>
-        <w:t xml:space="preserve"> nº {{</w:t>
-      </w:r>
-      <w:proofErr w:type="spellStart"/>
-      <w:r>
-        <w:t>numeroSequencial</w:t>
-      </w:r>
-      <w:proofErr w:type="spellEnd"/>
-      <w:r>
-        <w:t>}}</w:t>
-      </w:r>
-    </w:p>
-    <w:p/>
-    <w:p>
-      <w:proofErr w:type="spellStart"/>
-      <w:r>
-        <w:t>Aluno</w:t>
-      </w:r>
-      <w:proofErr w:type="spellEnd"/>
-      <w:r>
-        <w:t>: {{</w:t>
-      </w:r>
-      <w:proofErr w:type="spellStart"/>
-      <w:r>
-        <w:t>aluno</w:t>
-      </w:r>
-      <w:proofErr w:type="spellEnd"/>
-      <w:r>
-        <w:t>}}</w:t>
-      </w:r>
-    </w:p>
-    <w:p>
-      <w:proofErr w:type="spellStart"/>
-      <w:r>
-        <w:t>Turma</w:t>
-      </w:r>
-      <w:proofErr w:type="spellEnd"/>
-      <w:r>
-        <w:t>: {{</w:t>
-      </w:r>
-      <w:proofErr w:type="spellStart"/>
-      <w:r>
-        <w:t>turma</w:t>
-      </w:r>
-      <w:proofErr w:type="spellEnd"/>
-      <w:r>
-        <w:t>}}</w:t>
-      </w:r>
-    </w:p>
-    <w:p>
-      <w:r>
-        <w:t>Data: {{</w:t>
-      </w:r>
-      <w:proofErr w:type="spellStart"/>
-      <w:r>
-        <w:t>dataHora</w:t>
-      </w:r>
-      <w:proofErr w:type="spellEnd"/>
-      <w:r>
-        <w:t>}}</w:t>
-      </w:r>
-    </w:p>
-    <w:p/>
-    <w:p>
-      <w:proofErr w:type="spellStart"/>
-      <w:r>
-        <w:t>Descrição</w:t>
-      </w:r>
-      <w:proofErr w:type="spellEnd"/>
-      <w:r>
-        <w:t>:</w:t>
-      </w:r>
-    </w:p>
-    <w:p>
-      <w:r>
-        <w:t>{{</w:t>
-      </w:r>
-      <w:proofErr w:type="spellStart"/>
-      <w:r>
-        <w:t>descricaoInfracao</w:t>
-      </w:r>
-      <w:proofErr w:type="spellEnd"/>
-      <w:r>
-        <w:t xml:space="preserve">}} </w:t>
-      </w:r>
-    </w:p>
-    <w:p/>
-    <w:p>
-      <w:r>
-        <w:t>{{</w:t>
-      </w:r>
-      <w:proofErr w:type="spellStart"/>
-      <w:r>
-        <w:t>fraseResultado</w:t>
-      </w:r>
-      <w:proofErr w:type="spellEnd"/>
-      <w:r>
-        <w:t>}}</w:t>
-      </w:r>
-    </w:p>
-    <w:p/>
-    <w:tbl>
-      <w:tblPr>
-        <w:tblW w:w="0" w:type="auto"/>
-        <w:tblLook w:val="04A0" w:firstRow="1" w:lastRow="0" w:firstColumn="1" w:lastColumn="0" w:noHBand="0" w:noVBand="1"/>
-      </w:tblPr>
-      <w:tblGrid>
-        <w:gridCol w:w="4419"/>
-        <w:gridCol w:w="4419"/>
-      </w:tblGrid>
-      <w:tr>
-        <w:tc>
-          <w:tcPr>
-            <w:tcW w:w="4419" w:type="dxa"/>
-            <w:tcBorders>
-              <w:top w:val="single" w:sz="12" w:space="0" w:color="FF0000"/>
-              <w:left w:val="single" w:sz="12" w:space="0" w:color="FF0000"/>
-              <w:bottom w:val="single" w:sz="12" w:space="0" w:color="FF0000"/>
-              <w:right w:val="single" w:sz="4" w:space="0" w:color="auto"/>
-            </w:tcBorders>
-            <w:vAlign w:val="center"/>
-          </w:tcPr>
-          <w:p>
-            <w:pPr>
-              <w:jc w:val="center"/>
-            </w:pPr>
-            <w:r>
-              <w:rPr>
-                <w:b/>
-                <w:sz w:val="28"/>
-              </w:rPr>
-              <w:t>Nota Anterior: {{</w:t>
-            </w:r>
-            <w:proofErr w:type="spellStart"/>
-            <w:r>
-              <w:rPr>
-                <w:b/>
-                <w:sz w:val="28"/>
-              </w:rPr>
-              <w:t>notaAnterior</w:t>
-            </w:r>
-            <w:proofErr w:type="spellEnd"/>
-            <w:r>
-              <w:rPr>
-                <w:b/>
-                <w:sz w:val="28"/>
-              </w:rPr>
-              <w:t>}}</w:t>
-            </w:r>
-            <w:r>
-              <w:rPr>
-                <w:b/>
-                <w:sz w:val="28"/>
-              </w:rPr>
-              <w:br/>
-              <w:t xml:space="preserve">Nota </w:t>
-            </w:r>
-            <w:proofErr w:type="spellStart"/>
-            <w:r>
-              <w:rPr>
-                <w:b/>
-                <w:sz w:val="28"/>
-              </w:rPr>
-              <w:t>Atual</w:t>
-            </w:r>
-            <w:proofErr w:type="spellEnd"/>
-            <w:r>
-              <w:rPr>
-                <w:b/>
-                <w:sz w:val="28"/>
-              </w:rPr>
-              <w:t>: {{</w:t>
-            </w:r>
-            <w:proofErr w:type="spellStart"/>
-            <w:r>
-              <w:rPr>
-                <w:b/>
-                <w:sz w:val="28"/>
-              </w:rPr>
-              <w:t>notaAtual</w:t>
-            </w:r>
-            <w:proofErr w:type="spellEnd"/>
-            <w:r>
-              <w:rPr>
-                <w:b/>
-                <w:sz w:val="28"/>
-              </w:rPr>
-              <w:t>}}</w:t>
-            </w:r>
-          </w:p>
-        </w:tc>
-        <w:tc>
-          <w:tcPr>
-            <w:tcW w:w="4419" w:type="dxa"/>
-            <w:tcBorders>
-              <w:top w:val="single" w:sz="4" w:space="0" w:color="auto"/>
-              <w:left w:val="single" w:sz="4" w:space="0" w:color="auto"/>
-              <w:bottom w:val="single" w:sz="4" w:space="0" w:color="auto"/>
-              <w:right w:val="single" w:sz="4" w:space="0" w:color="auto"/>
-            </w:tcBorders>
-          </w:tcPr>
-          <w:p>
-            <w:proofErr w:type="spellStart"/>
-            <w:r>
-              <w:rPr>
-                <w:b/>
-                <w:bdr w:val="single" w:sz="4" w:space="0" w:color="auto"/>
-                <w:shd w:val="clear" w:color="auto" w:fill="8DB3E2" w:themeFill="text2" w:themeFillTint="66"/>
-              </w:rPr>
-              <w:t>Classificação</w:t>
-            </w:r>
-            <w:proofErr w:type="spellEnd"/>
-            <w:r>
-              <w:rPr>
-                <w:b/>
-                <w:bdr w:val="single" w:sz="4" w:space="0" w:color="auto"/>
-                <w:shd w:val="clear" w:color="auto" w:fill="8DB3E2" w:themeFill="text2" w:themeFillTint="66"/>
-              </w:rPr>
-              <w:t xml:space="preserve"> do </w:t>
-            </w:r>
-            <w:proofErr w:type="spellStart"/>
-            <w:r>
-              <w:rPr>
-                <w:b/>
-                <w:bdr w:val="single" w:sz="4" w:space="0" w:color="auto"/>
-                <w:shd w:val="clear" w:color="auto" w:fill="8DB3E2" w:themeFill="text2" w:themeFillTint="66"/>
-              </w:rPr>
-              <w:t>Comportamento</w:t>
-            </w:r>
-            <w:proofErr w:type="spellEnd"/>
-            <w:r>
-              <w:rPr>
-                <w:b/>
-                <w:bdr w:val="single" w:sz="4" w:space="0" w:color="auto"/>
-                <w:shd w:val="clear" w:color="auto" w:fill="8DB3E2" w:themeFill="text2" w:themeFillTint="66"/>
-              </w:rPr>
-              <w:t>:</w:t>
-            </w:r>
-            <w:r>
-              <w:rPr>
-                <w:b/>
-              </w:rPr>
-              <w:br/>
-            </w:r>
-            <w:r>
-              <w:t xml:space="preserve">9,50 a 10,00 - </w:t>
-            </w:r>
-            <w:proofErr w:type="spellStart"/>
-            <w:r>
-              <w:t>Excepcional</w:t>
-            </w:r>
-            <w:proofErr w:type="spellEnd"/>
-            <w:r>
-              <w:br/>
-              <w:t xml:space="preserve">8,50 a 9,49 - </w:t>
-            </w:r>
-            <w:proofErr w:type="spellStart"/>
-            <w:r>
-              <w:t>Ótimo</w:t>
-            </w:r>
-            <w:proofErr w:type="spellEnd"/>
-            <w:r>
-              <w:br/>
-              <w:t xml:space="preserve">7,00 </w:t>
-            </w:r>
-            <w:proofErr w:type="gramStart"/>
-            <w:r>
-              <w:t>a</w:t>
-            </w:r>
-            <w:proofErr w:type="gramEnd"/>
-            <w:r>
-              <w:t xml:space="preserve"> 8,49 - Bom</w:t>
-            </w:r>
-            <w:r>
-              <w:br/>
-              <w:t>5,00 a 6,99 - Regular</w:t>
-            </w:r>
-            <w:r>
-              <w:br/>
-              <w:t xml:space="preserve">3,00 a 4,99 - </w:t>
-            </w:r>
-            <w:proofErr w:type="spellStart"/>
-            <w:r>
-              <w:t>Insuficiente</w:t>
-            </w:r>
-            <w:proofErr w:type="spellEnd"/>
-            <w:r>
-              <w:br/>
-              <w:t xml:space="preserve">0,00 a 2,99 - </w:t>
-            </w:r>
-            <w:proofErr w:type="spellStart"/>
-            <w:r>
-              <w:t>Incompatível</w:t>
-            </w:r>
-            <w:proofErr w:type="spellEnd"/>
-          </w:p>
-        </w:tc>
-      </w:tr>
-    </w:tbl>
-    <w:p/>
-    <w:p/>
-    <w:p/>
-    <w:p/>
-    <w:p/>
-    <w:p/>
-    <w:p/>
-    <w:p>
-      <w:proofErr w:type="spellStart"/>
-      <w:r>
-        <w:rPr>
-          <w:b/>
-        </w:rPr>
-        <w:t>Observação</w:t>
-      </w:r>
-      <w:proofErr w:type="spellEnd"/>
-      <w:r>
-        <w:rPr>
-          <w:b/>
-        </w:rPr>
-        <w:t xml:space="preserve"> do Monitor:</w:t>
-      </w:r>
-    </w:p>
-    <w:p>
-      <w:r>
-        <w:t>{{</w:t>
-      </w:r>
-      <w:proofErr w:type="spellStart"/>
-      <w:r>
-        <w:t>observacao</w:t>
-      </w:r>
-      <w:proofErr w:type="spellEnd"/>
-      <w:r>
-        <w:t>}}</w:t>
-      </w:r>
-    </w:p>
-    <w:p/>
-    <w:p>
-      <w:r>
-        <w:t>{{</w:t>
-      </w:r>
-      <w:proofErr w:type="spellStart"/>
-      <w:r>
-        <w:t>fraseFinal</w:t>
-      </w:r>
-      <w:proofErr w:type="spellEnd"/>
-      <w:r>
-        <w:t>}}</w:t>
-      </w:r>
-    </w:p>
-    <w:p/>
-    <w:p>
-      <w:proofErr w:type="spellStart"/>
-      <w:r>
-        <w:t>Justificativa</w:t>
-      </w:r>
-      <w:proofErr w:type="spellEnd"/>
-      <w:r>
-        <w:t xml:space="preserve"> do </w:t>
-      </w:r>
-      <w:proofErr w:type="spellStart"/>
-      <w:r>
-        <w:t>responsável</w:t>
-      </w:r>
-      <w:proofErr w:type="spellEnd"/>
-      <w:r>
-        <w:t>:</w:t>
-      </w:r>
-    </w:p>
-    <w:p>
-      <w:r>
-        <w:t>__________________________________________________________________</w:t>
-      </w:r>
-    </w:p>
-    <w:p>
-      <w:r>
-        <w:t>__________________________________________________________________</w:t>
-      </w:r>
-    </w:p>
-    <w:p>
-      <w:r>
-        <w:t>__________________________________________________________________</w:t>
-      </w:r>
-    </w:p>
-    <w:p>
-      <w:r>
-        <w:t>__________________________________________________________________</w:t>
-      </w:r>
-    </w:p>
-    <w:p/>
-    <w:p/>
-    <w:p>
-      <w:pPr>
-        <w:jc w:val="center"/>
-      </w:pPr>
-    </w:p>
     <w:p>
       <w:pPr>
         <w:jc w:val="center"/>
       </w:pPr>
       <w:r>
-        <w:t>____________________________________________</w:t>
-      </w:r>
-    </w:p>
-    <w:p>
-      <w:pPr>
-        <w:jc w:val="center"/>
-      </w:pPr>
-      <w:proofErr w:type="spellStart"/>
-      <w:r>
-        <w:t>Assinatura</w:t>
-      </w:r>
-      <w:proofErr w:type="spellEnd"/>
-      <w:r>
-        <w:t xml:space="preserve"> do </w:t>
-      </w:r>
-      <w:proofErr w:type="spellStart"/>
-      <w:r>
-        <w:t>responsável</w:t>
-      </w:r>
-      <w:proofErr w:type="spellEnd"/>
-    </w:p>
-    <w:p>
-      <w:pPr>
-        <w:jc w:val="center"/>
-      </w:pPr>
-    </w:p>
-    <w:p>
-      <w:pPr>
-        <w:jc w:val="center"/>
-      </w:pPr>
-      <w:r>
-        <w:t>____________________________________________</w:t>
+        <w:rPr>
+          <w:b/>
+          <w:sz w:val="28"/>
+        </w:rPr>
+        <w:t>{{cabecalho}}</w:t>
       </w:r>
     </w:p>
     <w:p>
@@ -483,426 +19,374 @@
         <w:jc w:val="center"/>
       </w:pPr>
       <w:r>
-        <w:br/>
-      </w:r>
-      <w:proofErr w:type="spellStart"/>
-      <w:r>
-        <w:t>Coordenador</w:t>
-      </w:r>
-      <w:proofErr w:type="spellEnd"/>
-      <w:r>
-        <w:t xml:space="preserve"> do Corpo de </w:t>
-      </w:r>
-      <w:proofErr w:type="spellStart"/>
-      <w:r>
-        <w:t>Alunos</w:t>
-      </w:r>
-      <w:proofErr w:type="spellEnd"/>
-      <w:r>
-        <w:t xml:space="preserve"> do CMDP II-CZS</w:t>
+        <w:rPr>
+          <w:b/>
+          <w:sz w:val="24"/>
+        </w:rPr>
+        <w:t>{{regulamentoNome}}</w:t>
       </w:r>
     </w:p>
     <w:p/>
     <w:p>
       <w:pPr>
-        <w:ind w:firstLine="3544"/>
+        <w:jc w:val="center"/>
       </w:pPr>
       <w:r>
-        <w:t>Cruzeiro do Sul – AC, {{</w:t>
+        <w:rPr>
+          <w:b/>
+          <w:sz w:val="32"/>
+        </w:rPr>
+        <w:t>{{tituloDocumento}}</w:t>
       </w:r>
-      <w:proofErr w:type="spellStart"/>
+    </w:p>
+    <w:p>
+      <w:pPr>
+        <w:jc w:val="center"/>
+      </w:pPr>
       <w:r>
-        <w:t>dataHora</w:t>
-      </w:r>
-      <w:proofErr w:type="spellEnd"/>
-      <w:r>
-        <w:t>}}</w:t>
+        <w:rPr>
+          <w:sz w:val="24"/>
+        </w:rPr>
+        <w:t>Notificação nº {{numeroSequencial}}</w:t>
       </w:r>
     </w:p>
     <w:p/>
+    <w:tbl>
+      <w:tblPr>
+        <w:tblStyle w:val="Tabelacomgrade"/>
+        <w:tblW w:w="0" w:type="auto"/>
+        <w:tblLook w:val="04A0" w:firstRow="1" w:lastRow="0" w:firstColumn="1" w:lastColumn="0" w:noHBand="0" w:noVBand="1"/>
+      </w:tblPr>
+      <w:tblGrid>
+        <w:gridCol w:w="2880"/>
+        <w:gridCol w:w="2880"/>
+        <w:gridCol w:w="2880"/>
+      </w:tblGrid>
+      <w:tr>
+        <w:tc>
+          <w:tcPr>
+            <w:tcW w:w="2880" w:type="dxa"/>
+          </w:tcPr>
+          <w:p>
+            <w:r>
+              <w:t>Aluno</w:t>
+            </w:r>
+          </w:p>
+        </w:tc>
+        <w:tc>
+          <w:tcPr>
+            <w:tcW w:w="2880" w:type="dxa"/>
+          </w:tcPr>
+          <w:p>
+            <w:r>
+              <w:t>Turma</w:t>
+            </w:r>
+          </w:p>
+        </w:tc>
+        <w:tc>
+          <w:tcPr>
+            <w:tcW w:w="2880" w:type="dxa"/>
+          </w:tcPr>
+          <w:p>
+            <w:r>
+              <w:t>Data</w:t>
+            </w:r>
+          </w:p>
+        </w:tc>
+      </w:tr>
+      <w:tr>
+        <w:tc>
+          <w:tcPr>
+            <w:tcW w:w="2880" w:type="dxa"/>
+          </w:tcPr>
+          <w:p>
+            <w:r>
+              <w:t>{{aluno}}</w:t>
+            </w:r>
+          </w:p>
+        </w:tc>
+        <w:tc>
+          <w:tcPr>
+            <w:tcW w:w="2880" w:type="dxa"/>
+          </w:tcPr>
+          <w:p>
+            <w:r>
+              <w:t>{{turma}}</w:t>
+            </w:r>
+          </w:p>
+        </w:tc>
+        <w:tc>
+          <w:tcPr>
+            <w:tcW w:w="2880" w:type="dxa"/>
+          </w:tcPr>
+          <w:p>
+            <w:r>
+              <w:t>{{dataHora}}</w:t>
+            </w:r>
+          </w:p>
+        </w:tc>
+      </w:tr>
+    </w:tbl>
+    <w:p/>
+    <w:p>
+      <w:r>
+        <w:rPr>
+          <w:b/>
+          <w:sz w:val="24"/>
+        </w:rPr>
+        <w:t>Descrição da ocorrência</w:t>
+      </w:r>
+    </w:p>
+    <w:p>
+      <w:r>
+        <w:rPr>
+          <w:sz w:val="24"/>
+        </w:rPr>
+        <w:t>{{descricaoInfracao}}</w:t>
+      </w:r>
+    </w:p>
+    <w:p/>
+    <w:p>
+      <w:r>
+        <w:rPr>
+          <w:sz w:val="24"/>
+        </w:rPr>
+        <w:t>{{textoInstitucional}}</w:t>
+      </w:r>
+    </w:p>
+    <w:p/>
+    <w:p>
+      <w:r>
+        <w:rPr>
+          <w:sz w:val="24"/>
+        </w:rPr>
+        <w:t>{{fraseResultado}}</w:t>
+      </w:r>
+    </w:p>
+    <w:p/>
+    <w:p>
+      <w:r>
+        <w:rPr>
+          <w:b/>
+          <w:sz w:val="24"/>
+        </w:rPr>
+        <w:t>Evolução do comportamento</w:t>
+      </w:r>
+    </w:p>
+    <w:tbl>
+      <w:tblPr>
+        <w:tblStyle w:val="Tabelacomgrade"/>
+        <w:tblW w:w="0" w:type="auto"/>
+        <w:tblLook w:val="04A0" w:firstRow="1" w:lastRow="0" w:firstColumn="1" w:lastColumn="0" w:noHBand="0" w:noVBand="1"/>
+      </w:tblPr>
+      <w:tblGrid>
+        <w:gridCol w:w="2880"/>
+        <w:gridCol w:w="2880"/>
+        <w:gridCol w:w="2880"/>
+      </w:tblGrid>
+      <w:tr>
+        <w:tc>
+          <w:tcPr>
+            <w:tcW w:w="2880" w:type="dxa"/>
+          </w:tcPr>
+          <w:p>
+            <w:r>
+              <w:t>Nota Anterior</w:t>
+            </w:r>
+          </w:p>
+        </w:tc>
+        <w:tc>
+          <w:tcPr>
+            <w:tcW w:w="2880" w:type="dxa"/>
+          </w:tcPr>
+          <w:p>
+            <w:r>
+              <w:t>Nota Atual</w:t>
+            </w:r>
+          </w:p>
+        </w:tc>
+        <w:tc>
+          <w:tcPr>
+            <w:tcW w:w="2880" w:type="dxa"/>
+          </w:tcPr>
+          <w:p>
+            <w:r>
+              <w:t>Classificação</w:t>
+            </w:r>
+          </w:p>
+        </w:tc>
+      </w:tr>
+      <w:tr>
+        <w:tc>
+          <w:tcPr>
+            <w:tcW w:w="2880" w:type="dxa"/>
+          </w:tcPr>
+          <w:p>
+            <w:r>
+              <w:t>{{notaAnterior}}</w:t>
+            </w:r>
+          </w:p>
+        </w:tc>
+        <w:tc>
+          <w:tcPr>
+            <w:tcW w:w="2880" w:type="dxa"/>
+          </w:tcPr>
+          <w:p>
+            <w:r>
+              <w:t>{{notaAtual}}</w:t>
+            </w:r>
+          </w:p>
+        </w:tc>
+        <w:tc>
+          <w:tcPr>
+            <w:tcW w:w="2880" w:type="dxa"/>
+          </w:tcPr>
+          <w:p>
+            <w:r>
+              <w:t>{{comportamento}}</w:t>
+            </w:r>
+          </w:p>
+        </w:tc>
+      </w:tr>
+    </w:tbl>
+    <w:p/>
+    <w:p>
+      <w:r>
+        <w:rPr>
+          <w:b/>
+          <w:sz w:val="24"/>
+        </w:rPr>
+        <w:t>Observação do monitor</w:t>
+      </w:r>
+    </w:p>
+    <w:p>
+      <w:r>
+        <w:rPr>
+          <w:sz w:val="24"/>
+        </w:rPr>
+        <w:t>{{observacao}}</w:t>
+      </w:r>
+    </w:p>
+    <w:p/>
+    <w:p>
+      <w:r>
+        <w:rPr>
+          <w:sz w:val="24"/>
+        </w:rPr>
+        <w:t>{{fraseFinal}}</w:t>
+      </w:r>
+    </w:p>
+    <w:p/>
+    <w:p/>
+    <w:p/>
+    <w:p>
+      <w:r>
+        <w:rPr>
+          <w:b/>
+          <w:sz w:val="24"/>
+        </w:rPr>
+        <w:lastRenderedPageBreak/>
+        <w:t>Justificativa do responsável</w:t>
+      </w:r>
+    </w:p>
+    <w:p>
+      <w:r>
+        <w:t>________________________________________________________</w:t>
+      </w:r>
+      <w:r>
+        <w:t>_</w:t>
+      </w:r>
+      <w:r>
+        <w:t>________________________________________________________________________________________________________________________________________________________________________</w:t>
+      </w:r>
+      <w:r>
+        <w:t>_____________________________________________________________________________________________________________________________________________________________________________________________________________________________________________________________________________________________________________________________________________________________________________________________________________________</w:t>
+      </w:r>
+    </w:p>
+    <w:p/>
+    <w:p>
+      <w:pPr>
+        <w:spacing w:after="0"/>
+      </w:pPr>
+      <w:r>
+        <w:t>_______________________________________________________________</w:t>
+      </w:r>
+    </w:p>
+    <w:p>
+      <w:pPr>
+        <w:spacing w:after="0"/>
+      </w:pPr>
+      <w:r>
+        <w:t>Assinatura Responsável</w:t>
+      </w:r>
+    </w:p>
+    <w:p>
+      <w:pPr>
+        <w:spacing w:after="0"/>
+      </w:pPr>
+    </w:p>
+    <w:p>
+      <w:pPr>
+        <w:spacing w:after="0"/>
+      </w:pPr>
+    </w:p>
+    <w:p>
+      <w:pPr>
+        <w:spacing w:after="0"/>
+      </w:pPr>
+    </w:p>
+    <w:p>
+      <w:pPr>
+        <w:spacing w:after="0"/>
+      </w:pPr>
+    </w:p>
+    <w:p>
+      <w:pPr>
+        <w:spacing w:after="0"/>
+      </w:pPr>
+    </w:p>
+    <w:p>
+      <w:pPr>
+        <w:spacing w:after="0"/>
+      </w:pPr>
+    </w:p>
+    <w:p>
+      <w:pPr>
+        <w:spacing w:after="0"/>
+      </w:pPr>
+    </w:p>
+    <w:p>
+      <w:pPr>
+        <w:spacing w:after="0"/>
+      </w:pPr>
+      <w:r>
+        <w:t>________________________________________________________________</w:t>
+      </w:r>
+    </w:p>
+    <w:p>
+      <w:pPr>
+        <w:spacing w:after="0"/>
+      </w:pPr>
+      <w:r>
+        <w:t>Assinatura Coordenador de Turno</w:t>
+      </w:r>
+    </w:p>
+    <w:p>
+      <w:pPr>
+        <w:jc w:val="right"/>
+      </w:pPr>
+      <w:r>
+        <w:t>{{cidade}} – {{estado}}, {{dataHora}}</w:t>
+      </w:r>
+    </w:p>
     <w:sectPr>
-      <w:headerReference w:type="default" r:id="rId8"/>
       <w:pgSz w:w="12240" w:h="15840"/>
-      <w:pgMar w:top="1417" w:right="1701" w:bottom="1417" w:left="1701" w:header="720" w:footer="720" w:gutter="0"/>
+      <w:pgMar w:top="1440" w:right="1800" w:bottom="1440" w:left="1800" w:header="720" w:footer="720" w:gutter="0"/>
       <w:cols w:space="720"/>
       <w:docGrid w:linePitch="360"/>
     </w:sectPr>
   </w:body>
 </w:document>
-</file>
-
-<file path=word/endnotes.xml><?xml version="1.0" encoding="utf-8"?>
-<w:endnotes xmlns:wpc="http://schemas.microsoft.com/office/word/2010/wordprocessingCanvas" xmlns:cx="http://schemas.microsoft.com/office/drawing/2014/chartex" xmlns:cx1="http://schemas.microsoft.com/office/drawing/2015/9/8/chartex" xmlns:cx2="http://schemas.microsoft.com/office/drawing/2015/10/21/chartex" xmlns:cx3="http://schemas.microsoft.com/office/drawing/2016/5/9/chartex" xmlns:cx4="http://schemas.microsoft.com/office/drawing/2016/5/10/chartex" xmlns:cx5="http://schemas.microsoft.com/office/drawing/2016/5/11/chartex" xmlns:cx6="http://schemas.microsoft.com/office/drawing/2016/5/12/chartex" xmlns:cx7="http://schemas.microsoft.com/office/drawing/2016/5/13/chartex" xmlns:cx8="http://schemas.microsoft.com/office/drawing/2016/5/14/chartex" xmlns:mc="http://schemas.openxmlformats.org/markup-compatibility/2006" xmlns:aink="http://schemas.microsoft.com/office/drawing/2016/ink" xmlns:am3d="http://schemas.microsoft.com/office/drawing/2017/model3d" xmlns:o="urn:schemas-microsoft-com:office:office" xmlns:oel="http://schemas.microsoft.com/office/2019/extlst" xmlns:r="http://schemas.openxmlformats.org/officeDocument/2006/relationships" xmlns:m="http://schemas.openxmlformats.org/officeDocument/2006/math" xmlns:v="urn:schemas-microsoft-com:vml" xmlns:wp14="http://schemas.microsoft.com/office/word/2010/wordprocessingDrawing" xmlns:wp="http://schemas.openxmlformats.org/drawingml/2006/wordprocessingDrawing" xmlns:w10="urn:schemas-microsoft-com:office:word" xmlns:w="http://schemas.openxmlformats.org/wordprocessingml/2006/main" xmlns:w14="http://schemas.microsoft.com/office/word/2010/wordml" xmlns:w15="http://schemas.microsoft.com/office/word/2012/wordml" xmlns:w16cex="http://schemas.microsoft.com/office/word/2018/wordml/cex" xmlns:w16cid="http://schemas.microsoft.com/office/word/2016/wordml/cid" xmlns:w16="http://schemas.microsoft.com/office/word/2018/wordml" xmlns:w16du="http://schemas.microsoft.com/office/word/2023/wordml/word16du" xmlns:w16sdtdh="http://schemas.microsoft.com/office/word/2020/wordml/sdtdatahash" xmlns:w16sdtfl="http://schemas.microsoft.com/office/word/2024/wordml/sdtformatlock" xmlns:w16se="http://schemas.microsoft.com/office/word/2015/wordml/symex" xmlns:wpg="http://schemas.microsoft.com/office/word/2010/wordprocessingGroup" xmlns:wpi="http://schemas.microsoft.com/office/word/2010/wordprocessingInk" xmlns:wne="http://schemas.microsoft.com/office/word/2006/wordml" xmlns:wps="http://schemas.microsoft.com/office/word/2010/wordprocessingShape" mc:Ignorable="w14 w15 w16se w16cid w16 w16cex w16sdtdh w16sdtfl w16du wp14">
-  <w:endnote w:type="separator" w:id="-1">
-    <w:p>
-      <w:pPr>
-        <w:spacing w:after="0" w:line="240" w:lineRule="auto"/>
-      </w:pPr>
-      <w:r>
-        <w:separator/>
-      </w:r>
-    </w:p>
-  </w:endnote>
-  <w:endnote w:type="continuationSeparator" w:id="0">
-    <w:p>
-      <w:pPr>
-        <w:spacing w:after="0" w:line="240" w:lineRule="auto"/>
-      </w:pPr>
-      <w:r>
-        <w:continuationSeparator/>
-      </w:r>
-    </w:p>
-  </w:endnote>
-</w:endnotes>
-</file>
-
-<file path=word/footnotes.xml><?xml version="1.0" encoding="utf-8"?>
-<w:footnotes xmlns:wpc="http://schemas.microsoft.com/office/word/2010/wordprocessingCanvas" xmlns:cx="http://schemas.microsoft.com/office/drawing/2014/chartex" xmlns:cx1="http://schemas.microsoft.com/office/drawing/2015/9/8/chartex" xmlns:cx2="http://schemas.microsoft.com/office/drawing/2015/10/21/chartex" xmlns:cx3="http://schemas.microsoft.com/office/drawing/2016/5/9/chartex" xmlns:cx4="http://schemas.microsoft.com/office/drawing/2016/5/10/chartex" xmlns:cx5="http://schemas.microsoft.com/office/drawing/2016/5/11/chartex" xmlns:cx6="http://schemas.microsoft.com/office/drawing/2016/5/12/chartex" xmlns:cx7="http://schemas.microsoft.com/office/drawing/2016/5/13/chartex" xmlns:cx8="http://schemas.microsoft.com/office/drawing/2016/5/14/chartex" xmlns:mc="http://schemas.openxmlformats.org/markup-compatibility/2006" xmlns:aink="http://schemas.microsoft.com/office/drawing/2016/ink" xmlns:am3d="http://schemas.microsoft.com/office/drawing/2017/model3d" xmlns:o="urn:schemas-microsoft-com:office:office" xmlns:oel="http://schemas.microsoft.com/office/2019/extlst" xmlns:r="http://schemas.openxmlformats.org/officeDocument/2006/relationships" xmlns:m="http://schemas.openxmlformats.org/officeDocument/2006/math" xmlns:v="urn:schemas-microsoft-com:vml" xmlns:wp14="http://schemas.microsoft.com/office/word/2010/wordprocessingDrawing" xmlns:wp="http://schemas.openxmlformats.org/drawingml/2006/wordprocessingDrawing" xmlns:w10="urn:schemas-microsoft-com:office:word" xmlns:w="http://schemas.openxmlformats.org/wordprocessingml/2006/main" xmlns:w14="http://schemas.microsoft.com/office/word/2010/wordml" xmlns:w15="http://schemas.microsoft.com/office/word/2012/wordml" xmlns:w16cex="http://schemas.microsoft.com/office/word/2018/wordml/cex" xmlns:w16cid="http://schemas.microsoft.com/office/word/2016/wordml/cid" xmlns:w16="http://schemas.microsoft.com/office/word/2018/wordml" xmlns:w16du="http://schemas.microsoft.com/office/word/2023/wordml/word16du" xmlns:w16sdtdh="http://schemas.microsoft.com/office/word/2020/wordml/sdtdatahash" xmlns:w16sdtfl="http://schemas.microsoft.com/office/word/2024/wordml/sdtformatlock" xmlns:w16se="http://schemas.microsoft.com/office/word/2015/wordml/symex" xmlns:wpg="http://schemas.microsoft.com/office/word/2010/wordprocessingGroup" xmlns:wpi="http://schemas.microsoft.com/office/word/2010/wordprocessingInk" xmlns:wne="http://schemas.microsoft.com/office/word/2006/wordml" xmlns:wps="http://schemas.microsoft.com/office/word/2010/wordprocessingShape" mc:Ignorable="w14 w15 w16se w16cid w16 w16cex w16sdtdh w16sdtfl w16du wp14">
-  <w:footnote w:type="separator" w:id="-1">
-    <w:p>
-      <w:pPr>
-        <w:spacing w:after="0" w:line="240" w:lineRule="auto"/>
-      </w:pPr>
-      <w:r>
-        <w:separator/>
-      </w:r>
-    </w:p>
-  </w:footnote>
-  <w:footnote w:type="continuationSeparator" w:id="0">
-    <w:p>
-      <w:pPr>
-        <w:spacing w:after="0" w:line="240" w:lineRule="auto"/>
-      </w:pPr>
-      <w:r>
-        <w:continuationSeparator/>
-      </w:r>
-    </w:p>
-  </w:footnote>
-</w:footnotes>
-</file>
-
-<file path=word/header1.xml><?xml version="1.0" encoding="utf-8"?>
-<w:hdr xmlns:wpc="http://schemas.microsoft.com/office/word/2010/wordprocessingCanvas" xmlns:cx="http://schemas.microsoft.com/office/drawing/2014/chartex" xmlns:cx1="http://schemas.microsoft.com/office/drawing/2015/9/8/chartex" xmlns:cx2="http://schemas.microsoft.com/office/drawing/2015/10/21/chartex" xmlns:cx3="http://schemas.microsoft.com/office/drawing/2016/5/9/chartex" xmlns:cx4="http://schemas.microsoft.com/office/drawing/2016/5/10/chartex" xmlns:cx5="http://schemas.microsoft.com/office/drawing/2016/5/11/chartex" xmlns:cx6="http://schemas.microsoft.com/office/drawing/2016/5/12/chartex" xmlns:cx7="http://schemas.microsoft.com/office/drawing/2016/5/13/chartex" xmlns:cx8="http://schemas.microsoft.com/office/drawing/2016/5/14/chartex" xmlns:mc="http://schemas.openxmlformats.org/markup-compatibility/2006" xmlns:aink="http://schemas.microsoft.com/office/drawing/2016/ink" xmlns:am3d="http://schemas.microsoft.com/office/drawing/2017/model3d" xmlns:o="urn:schemas-microsoft-com:office:office" xmlns:oel="http://schemas.microsoft.com/office/2019/extlst" xmlns:r="http://schemas.openxmlformats.org/officeDocument/2006/relationships" xmlns:m="http://schemas.openxmlformats.org/officeDocument/2006/math" xmlns:v="urn:schemas-microsoft-com:vml" xmlns:wp14="http://schemas.microsoft.com/office/word/2010/wordprocessingDrawing" xmlns:wp="http://schemas.openxmlformats.org/drawingml/2006/wordprocessingDrawing" xmlns:w10="urn:schemas-microsoft-com:office:word" xmlns:w="http://schemas.openxmlformats.org/wordprocessingml/2006/main" xmlns:w14="http://schemas.microsoft.com/office/word/2010/wordml" xmlns:w15="http://schemas.microsoft.com/office/word/2012/wordml" xmlns:w16cex="http://schemas.microsoft.com/office/word/2018/wordml/cex" xmlns:w16cid="http://schemas.microsoft.com/office/word/2016/wordml/cid" xmlns:w16="http://schemas.microsoft.com/office/word/2018/wordml" xmlns:w16du="http://schemas.microsoft.com/office/word/2023/wordml/word16du" xmlns:w16sdtdh="http://schemas.microsoft.com/office/word/2020/wordml/sdtdatahash" xmlns:w16sdtfl="http://schemas.microsoft.com/office/word/2024/wordml/sdtformatlock" xmlns:w16se="http://schemas.microsoft.com/office/word/2015/wordml/symex" xmlns:wpg="http://schemas.microsoft.com/office/word/2010/wordprocessingGroup" xmlns:wpi="http://schemas.microsoft.com/office/word/2010/wordprocessingInk" xmlns:wne="http://schemas.microsoft.com/office/word/2006/wordml" xmlns:wps="http://schemas.microsoft.com/office/word/2010/wordprocessingShape" mc:Ignorable="w14 w15 w16se w16cid w16 w16cex w16sdtdh w16sdtfl w16du wp14">
-  <w:tbl>
-    <w:tblPr>
-      <w:tblpPr w:leftFromText="141" w:rightFromText="141" w:vertAnchor="text" w:horzAnchor="margin" w:tblpXSpec="center" w:tblpY="-55"/>
-      <w:tblW w:w="9180" w:type="dxa"/>
-      <w:tblBorders>
-        <w:top w:val="single" w:sz="4" w:space="0" w:color="FF0000"/>
-        <w:left w:val="single" w:sz="4" w:space="0" w:color="FF0000"/>
-        <w:bottom w:val="single" w:sz="4" w:space="0" w:color="FF0000"/>
-        <w:right w:val="single" w:sz="4" w:space="0" w:color="FF0000"/>
-        <w:insideH w:val="single" w:sz="4" w:space="0" w:color="FF0000"/>
-        <w:insideV w:val="single" w:sz="4" w:space="0" w:color="FF0000"/>
-      </w:tblBorders>
-      <w:tblLook w:val="01E0" w:firstRow="1" w:lastRow="1" w:firstColumn="1" w:lastColumn="1" w:noHBand="0" w:noVBand="0"/>
-    </w:tblPr>
-    <w:tblGrid>
-      <w:gridCol w:w="1401"/>
-      <w:gridCol w:w="6645"/>
-      <w:gridCol w:w="1134"/>
-    </w:tblGrid>
-    <w:tr>
-      <w:trPr>
-        <w:trHeight w:val="1183"/>
-      </w:trPr>
-      <w:tc>
-        <w:tcPr>
-          <w:tcW w:w="1401" w:type="dxa"/>
-          <w:tcBorders>
-            <w:top w:val="single" w:sz="12" w:space="0" w:color="FF0000"/>
-            <w:left w:val="single" w:sz="12" w:space="0" w:color="FF0000"/>
-            <w:bottom w:val="single" w:sz="12" w:space="0" w:color="FF0000"/>
-            <w:right w:val="single" w:sz="12" w:space="0" w:color="FF0000"/>
-          </w:tcBorders>
-          <w:vAlign w:val="center"/>
-        </w:tcPr>
-        <w:p>
-          <w:pPr>
-            <w:spacing w:after="0"/>
-            <w:jc w:val="both"/>
-            <w:rPr>
-              <w:rFonts w:ascii="Arial" w:hAnsi="Arial"/>
-              <w:b/>
-            </w:rPr>
-          </w:pPr>
-          <w:r>
-            <w:rPr>
-              <w:rFonts w:ascii="Arial" w:hAnsi="Arial"/>
-              <w:b/>
-              <w:noProof/>
-              <w:lang w:eastAsia="pt-BR"/>
-            </w:rPr>
-            <w:drawing>
-              <wp:inline distT="0" distB="0" distL="0" distR="0" wp14:anchorId="454EDD83" wp14:editId="7D94CD44">
-                <wp:extent cx="716280" cy="601980"/>
-                <wp:effectExtent l="0" t="0" r="0" b="0"/>
-                <wp:docPr id="1" name="Imagem 1"/>
-                <wp:cNvGraphicFramePr>
-                  <a:graphicFrameLocks xmlns:a="http://schemas.openxmlformats.org/drawingml/2006/main" noChangeAspect="1"/>
-                </wp:cNvGraphicFramePr>
-                <a:graphic xmlns:a="http://schemas.openxmlformats.org/drawingml/2006/main">
-                  <a:graphicData uri="http://schemas.openxmlformats.org/drawingml/2006/picture">
-                    <pic:pic xmlns:pic="http://schemas.openxmlformats.org/drawingml/2006/picture">
-                      <pic:nvPicPr>
-                        <pic:cNvPr id="0" name="Imagem 1"/>
-                        <pic:cNvPicPr>
-                          <a:picLocks noChangeAspect="1" noChangeArrowheads="1"/>
-                        </pic:cNvPicPr>
-                      </pic:nvPicPr>
-                      <pic:blipFill>
-                        <a:blip r:embed="rId1">
-                          <a:extLst>
-                            <a:ext uri="{28A0092B-C50C-407E-A947-70E740481C1C}">
-                              <a14:useLocalDpi xmlns:a14="http://schemas.microsoft.com/office/drawing/2010/main" val="0"/>
-                            </a:ext>
-                          </a:extLst>
-                        </a:blip>
-                        <a:srcRect/>
-                        <a:stretch>
-                          <a:fillRect/>
-                        </a:stretch>
-                      </pic:blipFill>
-                      <pic:spPr bwMode="auto">
-                        <a:xfrm>
-                          <a:off x="0" y="0"/>
-                          <a:ext cx="716280" cy="601980"/>
-                        </a:xfrm>
-                        <a:prstGeom prst="rect">
-                          <a:avLst/>
-                        </a:prstGeom>
-                        <a:noFill/>
-                        <a:ln>
-                          <a:noFill/>
-                        </a:ln>
-                      </pic:spPr>
-                    </pic:pic>
-                  </a:graphicData>
-                </a:graphic>
-              </wp:inline>
-            </w:drawing>
-          </w:r>
-        </w:p>
-      </w:tc>
-      <w:tc>
-        <w:tcPr>
-          <w:tcW w:w="6645" w:type="dxa"/>
-          <w:tcBorders>
-            <w:top w:val="single" w:sz="12" w:space="0" w:color="FF0000"/>
-            <w:left w:val="single" w:sz="12" w:space="0" w:color="FF0000"/>
-            <w:bottom w:val="single" w:sz="12" w:space="0" w:color="FF0000"/>
-            <w:right w:val="single" w:sz="12" w:space="0" w:color="FF0000"/>
-          </w:tcBorders>
-          <w:vAlign w:val="center"/>
-        </w:tcPr>
-        <w:p>
-          <w:pPr>
-            <w:spacing w:after="0"/>
-            <w:jc w:val="center"/>
-            <w:rPr>
-              <w:rFonts w:ascii="Arial" w:hAnsi="Arial"/>
-              <w:b/>
-            </w:rPr>
-          </w:pPr>
-          <w:r>
-            <w:rPr>
-              <w:rFonts w:ascii="Arial" w:hAnsi="Arial"/>
-              <w:b/>
-            </w:rPr>
-            <w:t>ESTADO DO ACRE</w:t>
-          </w:r>
-        </w:p>
-        <w:p>
-          <w:pPr>
-            <w:spacing w:after="0"/>
-            <w:jc w:val="center"/>
-            <w:rPr>
-              <w:rFonts w:ascii="Arial" w:hAnsi="Arial"/>
-              <w:b/>
-            </w:rPr>
-          </w:pPr>
-          <w:r>
-            <w:rPr>
-              <w:rFonts w:ascii="Arial" w:hAnsi="Arial"/>
-              <w:b/>
-            </w:rPr>
-            <w:t>CORPO DE BOMBEIROS MILITAR</w:t>
-          </w:r>
-        </w:p>
-        <w:p>
-          <w:pPr>
-            <w:spacing w:after="0"/>
-            <w:ind w:left="-119"/>
-            <w:jc w:val="center"/>
-            <w:rPr>
-              <w:rFonts w:ascii="Arial" w:hAnsi="Arial"/>
-              <w:b/>
-            </w:rPr>
-          </w:pPr>
-          <w:r>
-            <w:rPr>
-              <w:rFonts w:ascii="Arial" w:hAnsi="Arial" w:cs="Arial"/>
-              <w:b/>
-              <w:bCs/>
-              <w:sz w:val="20"/>
-              <w:szCs w:val="16"/>
-            </w:rPr>
-            <w:t>SECRETARIA DE ESTADO D</w:t>
-          </w:r>
-          <w:r>
-            <w:rPr>
-              <w:rFonts w:ascii="Arial" w:hAnsi="Arial" w:cs="Arial"/>
-              <w:b/>
-              <w:bCs/>
-              <w:sz w:val="20"/>
-              <w:szCs w:val="16"/>
-            </w:rPr>
-            <w:t>E</w:t>
-          </w:r>
-          <w:r>
-            <w:rPr>
-              <w:rFonts w:ascii="Arial" w:hAnsi="Arial" w:cs="Arial"/>
-              <w:b/>
-              <w:bCs/>
-              <w:sz w:val="20"/>
-              <w:szCs w:val="16"/>
-            </w:rPr>
-            <w:t xml:space="preserve"> EDUCAÇÃO, CULTURA E ESPORTES</w:t>
-          </w:r>
-          <w:r>
-            <w:rPr>
-              <w:rFonts w:ascii="Arial" w:hAnsi="Arial"/>
-              <w:b/>
-            </w:rPr>
-            <w:t xml:space="preserve"> </w:t>
-          </w:r>
-        </w:p>
-        <w:p>
-          <w:pPr>
-            <w:spacing w:after="0"/>
-            <w:jc w:val="center"/>
-            <w:rPr>
-              <w:rFonts w:ascii="Arial" w:hAnsi="Arial"/>
-              <w:sz w:val="26"/>
-            </w:rPr>
-          </w:pPr>
-          <w:r>
-            <w:rPr>
-              <w:rFonts w:ascii="Arial" w:hAnsi="Arial"/>
-              <w:b/>
-            </w:rPr>
-            <w:t>COLÉGIO MILITAR DOM PEDRO II</w:t>
-          </w:r>
-        </w:p>
-      </w:tc>
-      <w:tc>
-        <w:tcPr>
-          <w:tcW w:w="1134" w:type="dxa"/>
-          <w:tcBorders>
-            <w:top w:val="single" w:sz="12" w:space="0" w:color="FF0000"/>
-            <w:left w:val="single" w:sz="12" w:space="0" w:color="FF0000"/>
-            <w:bottom w:val="single" w:sz="12" w:space="0" w:color="FF0000"/>
-            <w:right w:val="single" w:sz="12" w:space="0" w:color="FF0000"/>
-          </w:tcBorders>
-        </w:tcPr>
-        <w:p>
-          <w:pPr>
-            <w:spacing w:after="0"/>
-            <w:jc w:val="both"/>
-            <w:rPr>
-              <w:rFonts w:ascii="Arial" w:hAnsi="Arial"/>
-            </w:rPr>
-          </w:pPr>
-          <w:r>
-            <w:rPr>
-              <w:noProof/>
-            </w:rPr>
-            <w:drawing>
-              <wp:anchor distT="0" distB="0" distL="114300" distR="114300" simplePos="0" relativeHeight="251659264" behindDoc="1" locked="0" layoutInCell="1" allowOverlap="1" wp14:anchorId="5093B25F" wp14:editId="4D2ECC57">
-                <wp:simplePos x="0" y="0"/>
-                <wp:positionH relativeFrom="column">
-                  <wp:posOffset>-22860</wp:posOffset>
-                </wp:positionH>
-                <wp:positionV relativeFrom="paragraph">
-                  <wp:posOffset>54610</wp:posOffset>
-                </wp:positionV>
-                <wp:extent cx="640080" cy="640080"/>
-                <wp:effectExtent l="0" t="0" r="0" b="0"/>
-                <wp:wrapNone/>
-                <wp:docPr id="1057050010" name="Imagem 2"/>
-                <wp:cNvGraphicFramePr>
-                  <a:graphicFrameLocks xmlns:a="http://schemas.openxmlformats.org/drawingml/2006/main" noChangeAspect="1"/>
-                </wp:cNvGraphicFramePr>
-                <a:graphic xmlns:a="http://schemas.openxmlformats.org/drawingml/2006/main">
-                  <a:graphicData uri="http://schemas.openxmlformats.org/drawingml/2006/picture">
-                    <pic:pic xmlns:pic="http://schemas.openxmlformats.org/drawingml/2006/picture">
-                      <pic:nvPicPr>
-                        <pic:cNvPr id="0" name="Imagem 2"/>
-                        <pic:cNvPicPr>
-                          <a:picLocks noChangeAspect="1" noChangeArrowheads="1"/>
-                        </pic:cNvPicPr>
-                      </pic:nvPicPr>
-                      <pic:blipFill>
-                        <a:blip r:embed="rId2">
-                          <a:extLst>
-                            <a:ext uri="{28A0092B-C50C-407E-A947-70E740481C1C}">
-                              <a14:useLocalDpi xmlns:a14="http://schemas.microsoft.com/office/drawing/2010/main" val="0"/>
-                            </a:ext>
-                          </a:extLst>
-                        </a:blip>
-                        <a:srcRect/>
-                        <a:stretch>
-                          <a:fillRect/>
-                        </a:stretch>
-                      </pic:blipFill>
-                      <pic:spPr bwMode="auto">
-                        <a:xfrm>
-                          <a:off x="0" y="0"/>
-                          <a:ext cx="640080" cy="640080"/>
-                        </a:xfrm>
-                        <a:prstGeom prst="rect">
-                          <a:avLst/>
-                        </a:prstGeom>
-                        <a:noFill/>
-                      </pic:spPr>
-                    </pic:pic>
-                  </a:graphicData>
-                </a:graphic>
-                <wp14:sizeRelH relativeFrom="page">
-                  <wp14:pctWidth>0</wp14:pctWidth>
-                </wp14:sizeRelH>
-                <wp14:sizeRelV relativeFrom="page">
-                  <wp14:pctHeight>0</wp14:pctHeight>
-                </wp14:sizeRelV>
-              </wp:anchor>
-            </w:drawing>
-          </w:r>
-        </w:p>
-        <w:p>
-          <w:pPr>
-            <w:spacing w:after="0"/>
-            <w:rPr>
-              <w:rFonts w:ascii="Arial" w:hAnsi="Arial"/>
-            </w:rPr>
-          </w:pPr>
-        </w:p>
-        <w:p>
-          <w:pPr>
-            <w:spacing w:after="0" w:line="240" w:lineRule="auto"/>
-            <w:rPr>
-              <w:rFonts w:ascii="Arial" w:hAnsi="Arial"/>
-            </w:rPr>
-          </w:pPr>
-        </w:p>
-      </w:tc>
-    </w:tr>
-  </w:tbl>
-  <w:p>
-    <w:pPr>
-      <w:pStyle w:val="Cabealho"/>
-    </w:pPr>
-  </w:p>
-</w:hdr>
 </file>
 
 <file path=word/numbering.xml><?xml version="1.0" encoding="utf-8"?>
@@ -1078,31 +562,31 @@
       </w:rPr>
     </w:lvl>
   </w:abstractNum>
-  <w:num w:numId="1" w16cid:durableId="133062181">
+  <w:num w:numId="1" w16cid:durableId="1412197179">
     <w:abstractNumId w:val="8"/>
   </w:num>
-  <w:num w:numId="2" w16cid:durableId="2134866547">
+  <w:num w:numId="2" w16cid:durableId="1488863961">
     <w:abstractNumId w:val="6"/>
   </w:num>
-  <w:num w:numId="3" w16cid:durableId="1650818846">
+  <w:num w:numId="3" w16cid:durableId="1720977597">
     <w:abstractNumId w:val="5"/>
   </w:num>
-  <w:num w:numId="4" w16cid:durableId="1805272010">
+  <w:num w:numId="4" w16cid:durableId="1827041946">
     <w:abstractNumId w:val="4"/>
   </w:num>
-  <w:num w:numId="5" w16cid:durableId="1122772411">
+  <w:num w:numId="5" w16cid:durableId="676881120">
     <w:abstractNumId w:val="7"/>
   </w:num>
-  <w:num w:numId="6" w16cid:durableId="980689309">
+  <w:num w:numId="6" w16cid:durableId="165678513">
     <w:abstractNumId w:val="3"/>
   </w:num>
-  <w:num w:numId="7" w16cid:durableId="2898623">
+  <w:num w:numId="7" w16cid:durableId="869493903">
     <w:abstractNumId w:val="2"/>
   </w:num>
-  <w:num w:numId="8" w16cid:durableId="1886914318">
+  <w:num w:numId="8" w16cid:durableId="1141577301">
     <w:abstractNumId w:val="1"/>
   </w:num>
-  <w:num w:numId="9" w16cid:durableId="520972547">
+  <w:num w:numId="9" w16cid:durableId="634483123">
     <w:abstractNumId w:val="0"/>
   </w:num>
 </w:numbering>
@@ -1498,10 +982,6 @@
     <w:name w:val="Normal"/>
     <w:qFormat/>
     <w:rsid w:val="00FC693F"/>
-    <w:rPr>
-      <w:rFonts w:ascii="Times New Roman" w:hAnsi="Times New Roman"/>
-      <w:sz w:val="24"/>
-    </w:rPr>
   </w:style>
   <w:style w:type="paragraph" w:styleId="Ttulo1">
     <w:name w:val="heading 1"/>
@@ -1893,6 +1373,7 @@
       <w:iCs/>
       <w:color w:val="4F81BD" w:themeColor="accent1"/>
       <w:spacing w:val="15"/>
+      <w:sz w:val="24"/>
       <w:szCs w:val="24"/>
     </w:rPr>
   </w:style>

</xml_diff>

<commit_message>
fix: alteracao no modelo de documento de envio de notificacao
</commit_message>
<xml_diff>
--- a/backend/pdf/modelo-notificacao-dinamico.docx
+++ b/backend/pdf/modelo-notificacao-dinamico.docx
@@ -1,6 +1,6 @@
 
 <file path=word/document.xml><?xml version="1.0" encoding="utf-8"?>
-<w:document xmlns:wpc="http://schemas.microsoft.com/office/word/2010/wordprocessingCanvas" xmlns:cx="http://schemas.microsoft.com/office/drawing/2014/chartex" xmlns:cx1="http://schemas.microsoft.com/office/drawing/2015/9/8/chartex" xmlns:cx2="http://schemas.microsoft.com/office/drawing/2015/10/21/chartex" xmlns:cx3="http://schemas.microsoft.com/office/drawing/2016/5/9/chartex" xmlns:cx4="http://schemas.microsoft.com/office/drawing/2016/5/10/chartex" xmlns:cx5="http://schemas.microsoft.com/office/drawing/2016/5/11/chartex" xmlns:cx6="http://schemas.microsoft.com/office/drawing/2016/5/12/chartex" xmlns:cx7="http://schemas.microsoft.com/office/drawing/2016/5/13/chartex" xmlns:cx8="http://schemas.microsoft.com/office/drawing/2016/5/14/chartex" xmlns:mc="http://schemas.openxmlformats.org/markup-compatibility/2006" xmlns:aink="http://schemas.microsoft.com/office/drawing/2016/ink" xmlns:am3d="http://schemas.microsoft.com/office/drawing/2017/model3d" xmlns:o="urn:schemas-microsoft-com:office:office" xmlns:oel="http://schemas.microsoft.com/office/2019/extlst" xmlns:r="http://schemas.openxmlformats.org/officeDocument/2006/relationships" xmlns:m="http://schemas.openxmlformats.org/officeDocument/2006/math" xmlns:v="urn:schemas-microsoft-com:vml" xmlns:wp14="http://schemas.microsoft.com/office/word/2010/wordprocessingDrawing" xmlns:wp="http://schemas.openxmlformats.org/drawingml/2006/wordprocessingDrawing" xmlns:w10="urn:schemas-microsoft-com:office:word" xmlns:w="http://schemas.openxmlformats.org/wordprocessingml/2006/main" xmlns:w14="http://schemas.microsoft.com/office/word/2010/wordml" xmlns:w15="http://schemas.microsoft.com/office/word/2012/wordml" xmlns:w16cex="http://schemas.microsoft.com/office/word/2018/wordml/cex" xmlns:w16cid="http://schemas.microsoft.com/office/word/2016/wordml/cid" xmlns:w16="http://schemas.microsoft.com/office/word/2018/wordml" xmlns:w16du="http://schemas.microsoft.com/office/word/2023/wordml/word16du" xmlns:w16sdtdh="http://schemas.microsoft.com/office/word/2020/wordml/sdtdatahash" xmlns:w16sdtfl="http://schemas.microsoft.com/office/word/2024/wordml/sdtformatlock" xmlns:w16se="http://schemas.microsoft.com/office/word/2015/wordml/symex" xmlns:wpg="http://schemas.microsoft.com/office/word/2010/wordprocessingGroup" xmlns:wpi="http://schemas.microsoft.com/office/word/2010/wordprocessingInk" xmlns:wne="http://schemas.microsoft.com/office/word/2006/wordml" xmlns:wps="http://schemas.microsoft.com/office/word/2010/wordprocessingShape" mc:Ignorable="w14 w15 w16se w16cid w16 w16cex w16sdtdh w16sdtfl w16du wp14">
+<w:document xmlns:wpc="http://schemas.microsoft.com/office/word/2010/wordprocessingCanvas" xmlns:cx="http://schemas.microsoft.com/office/drawing/2014/chartex" xmlns:cx1="http://schemas.microsoft.com/office/drawing/2015/9/8/chartex" xmlns:mc="http://schemas.openxmlformats.org/markup-compatibility/2006" xmlns:o="urn:schemas-microsoft-com:office:office" xmlns:r="http://schemas.openxmlformats.org/officeDocument/2006/relationships" xmlns:m="http://schemas.openxmlformats.org/officeDocument/2006/math" xmlns:v="urn:schemas-microsoft-com:vml" xmlns:wp14="http://schemas.microsoft.com/office/word/2010/wordprocessingDrawing" xmlns:wp="http://schemas.openxmlformats.org/drawingml/2006/wordprocessingDrawing" xmlns:w10="urn:schemas-microsoft-com:office:word" xmlns:w="http://schemas.openxmlformats.org/wordprocessingml/2006/main" xmlns:w14="http://schemas.microsoft.com/office/word/2010/wordml" xmlns:w15="http://schemas.microsoft.com/office/word/2012/wordml" xmlns:w16se="http://schemas.microsoft.com/office/word/2015/wordml/symex" xmlns:wpg="http://schemas.microsoft.com/office/word/2010/wordprocessingGroup" xmlns:wpi="http://schemas.microsoft.com/office/word/2010/wordprocessingInk" xmlns:wne="http://schemas.microsoft.com/office/word/2006/wordml" xmlns:wps="http://schemas.microsoft.com/office/word/2010/wordprocessingShape" mc:Ignorable="w14 w15 w16se wp14">
   <w:body>
     <w:p>
       <w:pPr>
@@ -11,7 +11,25 @@
           <w:b/>
           <w:sz w:val="28"/>
         </w:rPr>
-        <w:t>{{cabecalho}}</w:t>
+        <w:t>{{</w:t>
+      </w:r>
+      <w:proofErr w:type="spellStart"/>
+      <w:proofErr w:type="gramStart"/>
+      <w:r>
+        <w:rPr>
+          <w:b/>
+          <w:sz w:val="28"/>
+        </w:rPr>
+        <w:t>cabecalho</w:t>
+      </w:r>
+      <w:proofErr w:type="spellEnd"/>
+      <w:proofErr w:type="gramEnd"/>
+      <w:r>
+        <w:rPr>
+          <w:b/>
+          <w:sz w:val="28"/>
+        </w:rPr>
+        <w:t>}}</w:t>
       </w:r>
     </w:p>
     <w:p>
@@ -23,7 +41,25 @@
           <w:b/>
           <w:sz w:val="24"/>
         </w:rPr>
-        <w:t>{{regulamentoNome}}</w:t>
+        <w:t>{{</w:t>
+      </w:r>
+      <w:proofErr w:type="spellStart"/>
+      <w:proofErr w:type="gramStart"/>
+      <w:r>
+        <w:rPr>
+          <w:b/>
+          <w:sz w:val="24"/>
+        </w:rPr>
+        <w:t>regulamentoNome</w:t>
+      </w:r>
+      <w:proofErr w:type="spellEnd"/>
+      <w:proofErr w:type="gramEnd"/>
+      <w:r>
+        <w:rPr>
+          <w:b/>
+          <w:sz w:val="24"/>
+        </w:rPr>
+        <w:t>}}</w:t>
       </w:r>
     </w:p>
     <w:p/>
@@ -36,18 +72,58 @@
           <w:b/>
           <w:sz w:val="32"/>
         </w:rPr>
-        <w:t>{{tituloDocumento}}</w:t>
+        <w:t>{{</w:t>
+      </w:r>
+      <w:proofErr w:type="spellStart"/>
+      <w:proofErr w:type="gramStart"/>
+      <w:r>
+        <w:rPr>
+          <w:b/>
+          <w:sz w:val="32"/>
+        </w:rPr>
+        <w:t>tituloDocumento</w:t>
+      </w:r>
+      <w:proofErr w:type="spellEnd"/>
+      <w:proofErr w:type="gramEnd"/>
+      <w:r>
+        <w:rPr>
+          <w:b/>
+          <w:sz w:val="32"/>
+        </w:rPr>
+        <w:t>}}</w:t>
       </w:r>
     </w:p>
     <w:p>
       <w:pPr>
         <w:jc w:val="center"/>
       </w:pPr>
+      <w:proofErr w:type="spellStart"/>
       <w:r>
         <w:rPr>
           <w:sz w:val="24"/>
         </w:rPr>
-        <w:t>Notificação nº {{numeroSequencial}}</w:t>
+        <w:t>Notificação</w:t>
+      </w:r>
+      <w:proofErr w:type="spellEnd"/>
+      <w:r>
+        <w:rPr>
+          <w:sz w:val="24"/>
+        </w:rPr>
+        <w:t xml:space="preserve"> nº {{</w:t>
+      </w:r>
+      <w:proofErr w:type="spellStart"/>
+      <w:r>
+        <w:rPr>
+          <w:sz w:val="24"/>
+        </w:rPr>
+        <w:t>numeroSequencial</w:t>
+      </w:r>
+      <w:proofErr w:type="spellEnd"/>
+      <w:r>
+        <w:rPr>
+          <w:sz w:val="24"/>
+        </w:rPr>
+        <w:t>}}</w:t>
       </w:r>
     </w:p>
     <w:p/>
@@ -68,9 +144,11 @@
             <w:tcW w:w="2880" w:type="dxa"/>
           </w:tcPr>
           <w:p>
+            <w:proofErr w:type="spellStart"/>
             <w:r>
               <w:t>Aluno</w:t>
             </w:r>
+            <w:proofErr w:type="spellEnd"/>
           </w:p>
         </w:tc>
         <w:tc>
@@ -78,9 +156,11 @@
             <w:tcW w:w="2880" w:type="dxa"/>
           </w:tcPr>
           <w:p>
+            <w:proofErr w:type="spellStart"/>
             <w:r>
               <w:t>Turma</w:t>
             </w:r>
+            <w:proofErr w:type="spellEnd"/>
           </w:p>
         </w:tc>
         <w:tc>
@@ -101,7 +181,15 @@
           </w:tcPr>
           <w:p>
             <w:r>
-              <w:t>{{aluno}}</w:t>
+              <w:t>{{</w:t>
+            </w:r>
+            <w:proofErr w:type="spellStart"/>
+            <w:r>
+              <w:t>aluno</w:t>
+            </w:r>
+            <w:proofErr w:type="spellEnd"/>
+            <w:r>
+              <w:t>}}</w:t>
             </w:r>
           </w:p>
         </w:tc>
@@ -111,7 +199,15 @@
           </w:tcPr>
           <w:p>
             <w:r>
-              <w:t>{{turma}}</w:t>
+              <w:t>{{</w:t>
+            </w:r>
+            <w:proofErr w:type="spellStart"/>
+            <w:r>
+              <w:t>turma</w:t>
+            </w:r>
+            <w:proofErr w:type="spellEnd"/>
+            <w:r>
+              <w:t>}}</w:t>
             </w:r>
           </w:p>
         </w:tc>
@@ -121,7 +217,15 @@
           </w:tcPr>
           <w:p>
             <w:r>
-              <w:t>{{dataHora}}</w:t>
+              <w:t>{{</w:t>
+            </w:r>
+            <w:proofErr w:type="spellStart"/>
+            <w:r>
+              <w:t>dataHora</w:t>
+            </w:r>
+            <w:proofErr w:type="spellEnd"/>
+            <w:r>
+              <w:t>}}</w:t>
             </w:r>
           </w:p>
         </w:tc>
@@ -129,20 +233,54 @@
     </w:tbl>
     <w:p/>
     <w:p>
+      <w:proofErr w:type="spellStart"/>
       <w:r>
         <w:rPr>
           <w:b/>
           <w:sz w:val="24"/>
         </w:rPr>
-        <w:t>Descrição da ocorrência</w:t>
+        <w:t>Descrição</w:t>
       </w:r>
+      <w:proofErr w:type="spellEnd"/>
+      <w:r>
+        <w:rPr>
+          <w:b/>
+          <w:sz w:val="24"/>
+        </w:rPr>
+        <w:t xml:space="preserve"> da </w:t>
+      </w:r>
+      <w:proofErr w:type="spellStart"/>
+      <w:r>
+        <w:rPr>
+          <w:b/>
+          <w:sz w:val="24"/>
+        </w:rPr>
+        <w:t>ocorrência</w:t>
+      </w:r>
+      <w:proofErr w:type="spellEnd"/>
     </w:p>
     <w:p>
       <w:r>
         <w:rPr>
           <w:sz w:val="24"/>
         </w:rPr>
-        <w:t>{{descricaoInfracao}}</w:t>
+        <w:t>{{</w:t>
+      </w:r>
+      <w:proofErr w:type="spellStart"/>
+      <w:proofErr w:type="gramStart"/>
+      <w:r>
+        <w:rPr>
+          <w:sz w:val="24"/>
+        </w:rPr>
+        <w:t>descricaoInfracao</w:t>
+      </w:r>
+      <w:proofErr w:type="spellEnd"/>
+      <w:proofErr w:type="gramEnd"/>
+      <w:r>
+        <w:rPr>
+          <w:sz w:val="24"/>
+        </w:rPr>
+        <w:t>}}</w:t>
       </w:r>
     </w:p>
     <w:p/>
@@ -151,7 +289,23 @@
         <w:rPr>
           <w:sz w:val="24"/>
         </w:rPr>
-        <w:t>{{textoInstitucional}}</w:t>
+        <w:t>{{</w:t>
+      </w:r>
+      <w:proofErr w:type="spellStart"/>
+      <w:proofErr w:type="gramStart"/>
+      <w:r>
+        <w:rPr>
+          <w:sz w:val="24"/>
+        </w:rPr>
+        <w:t>textoInstitucional</w:t>
+      </w:r>
+      <w:proofErr w:type="spellEnd"/>
+      <w:proofErr w:type="gramEnd"/>
+      <w:r>
+        <w:rPr>
+          <w:sz w:val="24"/>
+        </w:rPr>
+        <w:t>}}</w:t>
       </w:r>
     </w:p>
     <w:p/>
@@ -160,18 +314,52 @@
         <w:rPr>
           <w:sz w:val="24"/>
         </w:rPr>
-        <w:t>{{fraseResultado}}</w:t>
+        <w:t>{{</w:t>
+      </w:r>
+      <w:proofErr w:type="spellStart"/>
+      <w:proofErr w:type="gramStart"/>
+      <w:r>
+        <w:rPr>
+          <w:sz w:val="24"/>
+        </w:rPr>
+        <w:t>fraseResultado</w:t>
+      </w:r>
+      <w:proofErr w:type="spellEnd"/>
+      <w:proofErr w:type="gramEnd"/>
+      <w:r>
+        <w:rPr>
+          <w:sz w:val="24"/>
+        </w:rPr>
+        <w:t>}}</w:t>
       </w:r>
     </w:p>
     <w:p/>
     <w:p>
+      <w:proofErr w:type="spellStart"/>
       <w:r>
         <w:rPr>
           <w:b/>
           <w:sz w:val="24"/>
         </w:rPr>
-        <w:t>Evolução do comportamento</w:t>
+        <w:t>Evolução</w:t>
       </w:r>
+      <w:proofErr w:type="spellEnd"/>
+      <w:r>
+        <w:rPr>
+          <w:b/>
+          <w:sz w:val="24"/>
+        </w:rPr>
+        <w:t xml:space="preserve"> do </w:t>
+      </w:r>
+      <w:proofErr w:type="spellStart"/>
+      <w:r>
+        <w:rPr>
+          <w:b/>
+          <w:sz w:val="24"/>
+        </w:rPr>
+        <w:t>comportamento</w:t>
+      </w:r>
+      <w:proofErr w:type="spellEnd"/>
     </w:p>
     <w:tbl>
       <w:tblPr>
@@ -201,8 +389,13 @@
           </w:tcPr>
           <w:p>
             <w:r>
-              <w:t>Nota Atual</w:t>
+              <w:t xml:space="preserve">Nota </w:t>
             </w:r>
+            <w:proofErr w:type="spellStart"/>
+            <w:r>
+              <w:t>Atual</w:t>
+            </w:r>
+            <w:proofErr w:type="spellEnd"/>
           </w:p>
         </w:tc>
         <w:tc>
@@ -210,9 +403,11 @@
             <w:tcW w:w="2880" w:type="dxa"/>
           </w:tcPr>
           <w:p>
+            <w:proofErr w:type="spellStart"/>
             <w:r>
               <w:t>Classificação</w:t>
             </w:r>
+            <w:proofErr w:type="spellEnd"/>
           </w:p>
         </w:tc>
       </w:tr>
@@ -223,7 +418,15 @@
           </w:tcPr>
           <w:p>
             <w:r>
-              <w:t>{{notaAnterior}}</w:t>
+              <w:t>{{</w:t>
+            </w:r>
+            <w:proofErr w:type="spellStart"/>
+            <w:r>
+              <w:t>notaAnterior</w:t>
+            </w:r>
+            <w:proofErr w:type="spellEnd"/>
+            <w:r>
+              <w:t>}}</w:t>
             </w:r>
           </w:p>
         </w:tc>
@@ -233,7 +436,15 @@
           </w:tcPr>
           <w:p>
             <w:r>
-              <w:t>{{notaAtual}}</w:t>
+              <w:t>{{</w:t>
+            </w:r>
+            <w:proofErr w:type="spellStart"/>
+            <w:r>
+              <w:t>notaAtual</w:t>
+            </w:r>
+            <w:proofErr w:type="spellEnd"/>
+            <w:r>
+              <w:t>}}</w:t>
             </w:r>
           </w:p>
         </w:tc>
@@ -243,7 +454,15 @@
           </w:tcPr>
           <w:p>
             <w:r>
-              <w:t>{{comportamento}}</w:t>
+              <w:t>{{</w:t>
+            </w:r>
+            <w:proofErr w:type="spellStart"/>
+            <w:r>
+              <w:t>comportamento</w:t>
+            </w:r>
+            <w:proofErr w:type="spellEnd"/>
+            <w:r>
+              <w:t>}}</w:t>
             </w:r>
           </w:p>
         </w:tc>
@@ -251,12 +470,21 @@
     </w:tbl>
     <w:p/>
     <w:p>
+      <w:proofErr w:type="spellStart"/>
       <w:r>
         <w:rPr>
           <w:b/>
           <w:sz w:val="24"/>
         </w:rPr>
-        <w:t>Observação do monitor</w:t>
+        <w:t>Observação</w:t>
+      </w:r>
+      <w:proofErr w:type="spellEnd"/>
+      <w:r>
+        <w:rPr>
+          <w:b/>
+          <w:sz w:val="24"/>
+        </w:rPr>
+        <w:t xml:space="preserve"> do monitor</w:t>
       </w:r>
     </w:p>
     <w:p>
@@ -264,7 +492,23 @@
         <w:rPr>
           <w:sz w:val="24"/>
         </w:rPr>
-        <w:t>{{observacao}}</w:t>
+        <w:t>{{</w:t>
+      </w:r>
+      <w:proofErr w:type="spellStart"/>
+      <w:proofErr w:type="gramStart"/>
+      <w:r>
+        <w:rPr>
+          <w:sz w:val="24"/>
+        </w:rPr>
+        <w:t>observacao</w:t>
+      </w:r>
+      <w:proofErr w:type="spellEnd"/>
+      <w:proofErr w:type="gramEnd"/>
+      <w:r>
+        <w:rPr>
+          <w:sz w:val="24"/>
+        </w:rPr>
+        <w:t>}}</w:t>
       </w:r>
     </w:p>
     <w:p/>
@@ -273,21 +517,55 @@
         <w:rPr>
           <w:sz w:val="24"/>
         </w:rPr>
-        <w:t>{{fraseFinal}}</w:t>
+        <w:t>{{</w:t>
+      </w:r>
+      <w:proofErr w:type="spellStart"/>
+      <w:proofErr w:type="gramStart"/>
+      <w:r>
+        <w:rPr>
+          <w:sz w:val="24"/>
+        </w:rPr>
+        <w:t>fraseFinal</w:t>
+      </w:r>
+      <w:proofErr w:type="spellEnd"/>
+      <w:proofErr w:type="gramEnd"/>
+      <w:r>
+        <w:rPr>
+          <w:sz w:val="24"/>
+        </w:rPr>
+        <w:t>}}</w:t>
       </w:r>
     </w:p>
     <w:p/>
     <w:p/>
     <w:p/>
     <w:p>
+      <w:proofErr w:type="spellStart"/>
       <w:r>
         <w:rPr>
           <w:b/>
           <w:sz w:val="24"/>
         </w:rPr>
         <w:lastRenderedPageBreak/>
-        <w:t>Justificativa do responsável</w:t>
+        <w:t>Justificativa</w:t>
       </w:r>
+      <w:proofErr w:type="spellEnd"/>
+      <w:r>
+        <w:rPr>
+          <w:b/>
+          <w:sz w:val="24"/>
+        </w:rPr>
+        <w:t xml:space="preserve"> do </w:t>
+      </w:r>
+      <w:proofErr w:type="spellStart"/>
+      <w:r>
+        <w:rPr>
+          <w:b/>
+          <w:sz w:val="24"/>
+        </w:rPr>
+        <w:t>responsável</w:t>
+      </w:r>
+      <w:proofErr w:type="spellEnd"/>
     </w:p>
     <w:p>
       <w:r>
@@ -307,6 +585,7 @@
     <w:p>
       <w:pPr>
         <w:spacing w:after="0"/>
+        <w:jc w:val="center"/>
       </w:pPr>
       <w:r>
         <w:t>_______________________________________________________________</w:t>
@@ -315,49 +594,68 @@
     <w:p>
       <w:pPr>
         <w:spacing w:after="0"/>
+        <w:jc w:val="center"/>
       </w:pPr>
+      <w:proofErr w:type="spellStart"/>
       <w:r>
-        <w:t>Assinatura Responsável</w:t>
+        <w:t>Assinatura</w:t>
       </w:r>
+      <w:proofErr w:type="spellEnd"/>
+      <w:r>
+        <w:t xml:space="preserve"> </w:t>
+      </w:r>
+      <w:proofErr w:type="spellStart"/>
+      <w:r>
+        <w:t>Responsável</w:t>
+      </w:r>
+      <w:proofErr w:type="spellEnd"/>
     </w:p>
     <w:p>
       <w:pPr>
         <w:spacing w:after="0"/>
+        <w:jc w:val="center"/>
       </w:pPr>
     </w:p>
     <w:p>
       <w:pPr>
         <w:spacing w:after="0"/>
+        <w:jc w:val="center"/>
       </w:pPr>
     </w:p>
     <w:p>
       <w:pPr>
         <w:spacing w:after="0"/>
+        <w:jc w:val="center"/>
       </w:pPr>
     </w:p>
     <w:p>
       <w:pPr>
         <w:spacing w:after="0"/>
+        <w:jc w:val="center"/>
       </w:pPr>
     </w:p>
     <w:p>
       <w:pPr>
         <w:spacing w:after="0"/>
+        <w:jc w:val="center"/>
       </w:pPr>
     </w:p>
     <w:p>
       <w:pPr>
         <w:spacing w:after="0"/>
+        <w:jc w:val="center"/>
       </w:pPr>
     </w:p>
     <w:p>
       <w:pPr>
         <w:spacing w:after="0"/>
+        <w:jc w:val="center"/>
       </w:pPr>
     </w:p>
     <w:p>
       <w:pPr>
         <w:spacing w:after="0"/>
+        <w:jc w:val="center"/>
       </w:pPr>
       <w:r>
         <w:t>________________________________________________________________</w:t>
@@ -366,17 +664,70 @@
     <w:p>
       <w:pPr>
         <w:spacing w:after="0"/>
+        <w:jc w:val="center"/>
       </w:pPr>
+      <w:proofErr w:type="spellStart"/>
       <w:r>
-        <w:t>Assinatura Coordenador de Turno</w:t>
+        <w:t>Assinatura</w:t>
       </w:r>
+      <w:proofErr w:type="spellEnd"/>
+      <w:r>
+        <w:t xml:space="preserve"> </w:t>
+      </w:r>
+      <w:proofErr w:type="spellStart"/>
+      <w:r>
+        <w:t>Coordenador</w:t>
+      </w:r>
+      <w:proofErr w:type="spellEnd"/>
+      <w:r>
+        <w:t xml:space="preserve"> de </w:t>
+      </w:r>
+      <w:proofErr w:type="spellStart"/>
+      <w:r>
+        <w:t>Turno</w:t>
+      </w:r>
+      <w:proofErr w:type="spellEnd"/>
     </w:p>
     <w:p>
       <w:pPr>
         <w:jc w:val="right"/>
       </w:pPr>
+    </w:p>
+    <w:p>
+      <w:pPr>
+        <w:jc w:val="right"/>
+      </w:pPr>
+      <w:bookmarkStart w:id="0" w:name="_GoBack"/>
+      <w:bookmarkEnd w:id="0"/>
+      <w:proofErr w:type="spellStart"/>
       <w:r>
-        <w:t>{{cidade}} – {{estado}}, {{dataHora}}</w:t>
+        <w:t>Cruzeiro</w:t>
+      </w:r>
+      <w:proofErr w:type="spellEnd"/>
+      <w:r>
+        <w:t xml:space="preserve"> do </w:t>
+      </w:r>
+      <w:proofErr w:type="spellStart"/>
+      <w:r>
+        <w:t>Sul</w:t>
+      </w:r>
+      <w:proofErr w:type="spellEnd"/>
+      <w:r>
+        <w:t xml:space="preserve"> – </w:t>
+      </w:r>
+      <w:r>
+        <w:t>Acre</w:t>
+      </w:r>
+      <w:r>
+        <w:t>, {{</w:t>
+      </w:r>
+      <w:proofErr w:type="spellStart"/>
+      <w:r>
+        <w:t>dataHora</w:t>
+      </w:r>
+      <w:proofErr w:type="spellEnd"/>
+      <w:r>
+        <w:t>}}</w:t>
       </w:r>
     </w:p>
     <w:sectPr>
@@ -390,7 +741,7 @@
 </file>
 
 <file path=word/numbering.xml><?xml version="1.0" encoding="utf-8"?>
-<w:numbering xmlns:wpc="http://schemas.microsoft.com/office/word/2010/wordprocessingCanvas" xmlns:cx="http://schemas.microsoft.com/office/drawing/2014/chartex" xmlns:cx1="http://schemas.microsoft.com/office/drawing/2015/9/8/chartex" xmlns:cx2="http://schemas.microsoft.com/office/drawing/2015/10/21/chartex" xmlns:cx3="http://schemas.microsoft.com/office/drawing/2016/5/9/chartex" xmlns:cx4="http://schemas.microsoft.com/office/drawing/2016/5/10/chartex" xmlns:cx5="http://schemas.microsoft.com/office/drawing/2016/5/11/chartex" xmlns:cx6="http://schemas.microsoft.com/office/drawing/2016/5/12/chartex" xmlns:cx7="http://schemas.microsoft.com/office/drawing/2016/5/13/chartex" xmlns:cx8="http://schemas.microsoft.com/office/drawing/2016/5/14/chartex" xmlns:mc="http://schemas.openxmlformats.org/markup-compatibility/2006" xmlns:aink="http://schemas.microsoft.com/office/drawing/2016/ink" xmlns:am3d="http://schemas.microsoft.com/office/drawing/2017/model3d" xmlns:o="urn:schemas-microsoft-com:office:office" xmlns:oel="http://schemas.microsoft.com/office/2019/extlst" xmlns:r="http://schemas.openxmlformats.org/officeDocument/2006/relationships" xmlns:m="http://schemas.openxmlformats.org/officeDocument/2006/math" xmlns:v="urn:schemas-microsoft-com:vml" xmlns:wp14="http://schemas.microsoft.com/office/word/2010/wordprocessingDrawing" xmlns:wp="http://schemas.openxmlformats.org/drawingml/2006/wordprocessingDrawing" xmlns:w10="urn:schemas-microsoft-com:office:word" xmlns:w="http://schemas.openxmlformats.org/wordprocessingml/2006/main" xmlns:w14="http://schemas.microsoft.com/office/word/2010/wordml" xmlns:w15="http://schemas.microsoft.com/office/word/2012/wordml" xmlns:w16cex="http://schemas.microsoft.com/office/word/2018/wordml/cex" xmlns:w16cid="http://schemas.microsoft.com/office/word/2016/wordml/cid" xmlns:w16="http://schemas.microsoft.com/office/word/2018/wordml" xmlns:w16du="http://schemas.microsoft.com/office/word/2023/wordml/word16du" xmlns:w16sdtdh="http://schemas.microsoft.com/office/word/2020/wordml/sdtdatahash" xmlns:w16sdtfl="http://schemas.microsoft.com/office/word/2024/wordml/sdtformatlock" xmlns:w16se="http://schemas.microsoft.com/office/word/2015/wordml/symex" xmlns:wpg="http://schemas.microsoft.com/office/word/2010/wordprocessingGroup" xmlns:wpi="http://schemas.microsoft.com/office/word/2010/wordprocessingInk" xmlns:wne="http://schemas.microsoft.com/office/word/2006/wordml" xmlns:wps="http://schemas.microsoft.com/office/word/2010/wordprocessingShape" mc:Ignorable="w14 w15 w16se w16cid w16 w16cex w16sdtdh w16sdtfl w16du wp14">
+<w:numbering xmlns:wpc="http://schemas.microsoft.com/office/word/2010/wordprocessingCanvas" xmlns:cx="http://schemas.microsoft.com/office/drawing/2014/chartex" xmlns:cx1="http://schemas.microsoft.com/office/drawing/2015/9/8/chartex" xmlns:mc="http://schemas.openxmlformats.org/markup-compatibility/2006" xmlns:o="urn:schemas-microsoft-com:office:office" xmlns:r="http://schemas.openxmlformats.org/officeDocument/2006/relationships" xmlns:m="http://schemas.openxmlformats.org/officeDocument/2006/math" xmlns:v="urn:schemas-microsoft-com:vml" xmlns:wp14="http://schemas.microsoft.com/office/word/2010/wordprocessingDrawing" xmlns:wp="http://schemas.openxmlformats.org/drawingml/2006/wordprocessingDrawing" xmlns:w10="urn:schemas-microsoft-com:office:word" xmlns:w="http://schemas.openxmlformats.org/wordprocessingml/2006/main" xmlns:w14="http://schemas.microsoft.com/office/word/2010/wordml" xmlns:w15="http://schemas.microsoft.com/office/word/2012/wordml" xmlns:w16se="http://schemas.microsoft.com/office/word/2015/wordml/symex" xmlns:wpg="http://schemas.microsoft.com/office/word/2010/wordprocessingGroup" xmlns:wpi="http://schemas.microsoft.com/office/word/2010/wordprocessingInk" xmlns:wne="http://schemas.microsoft.com/office/word/2006/wordml" xmlns:wps="http://schemas.microsoft.com/office/word/2010/wordprocessingShape" mc:Ignorable="w14 w15 w16se wp14">
   <w:abstractNum w:abstractNumId="0" w15:restartNumberingAfterBreak="0">
     <w:nsid w:val="FFFFFF7C"/>
     <w:multiLevelType w:val="singleLevel"/>
@@ -562,38 +913,38 @@
       </w:rPr>
     </w:lvl>
   </w:abstractNum>
-  <w:num w:numId="1" w16cid:durableId="1412197179">
+  <w:num w:numId="1">
     <w:abstractNumId w:val="8"/>
   </w:num>
-  <w:num w:numId="2" w16cid:durableId="1488863961">
+  <w:num w:numId="2">
     <w:abstractNumId w:val="6"/>
   </w:num>
-  <w:num w:numId="3" w16cid:durableId="1720977597">
+  <w:num w:numId="3">
     <w:abstractNumId w:val="5"/>
   </w:num>
-  <w:num w:numId="4" w16cid:durableId="1827041946">
+  <w:num w:numId="4">
     <w:abstractNumId w:val="4"/>
   </w:num>
-  <w:num w:numId="5" w16cid:durableId="676881120">
+  <w:num w:numId="5">
     <w:abstractNumId w:val="7"/>
   </w:num>
-  <w:num w:numId="6" w16cid:durableId="165678513">
+  <w:num w:numId="6">
     <w:abstractNumId w:val="3"/>
   </w:num>
-  <w:num w:numId="7" w16cid:durableId="869493903">
+  <w:num w:numId="7">
     <w:abstractNumId w:val="2"/>
   </w:num>
-  <w:num w:numId="8" w16cid:durableId="1141577301">
+  <w:num w:numId="8">
     <w:abstractNumId w:val="1"/>
   </w:num>
-  <w:num w:numId="9" w16cid:durableId="634483123">
+  <w:num w:numId="9">
     <w:abstractNumId w:val="0"/>
   </w:num>
 </w:numbering>
 </file>
 
 <file path=word/styles.xml><?xml version="1.0" encoding="utf-8"?>
-<w:styles xmlns:mc="http://schemas.openxmlformats.org/markup-compatibility/2006" xmlns:r="http://schemas.openxmlformats.org/officeDocument/2006/relationships" xmlns:w="http://schemas.openxmlformats.org/wordprocessingml/2006/main" xmlns:w14="http://schemas.microsoft.com/office/word/2010/wordml" xmlns:w15="http://schemas.microsoft.com/office/word/2012/wordml" xmlns:w16cex="http://schemas.microsoft.com/office/word/2018/wordml/cex" xmlns:w16cid="http://schemas.microsoft.com/office/word/2016/wordml/cid" xmlns:w16="http://schemas.microsoft.com/office/word/2018/wordml" xmlns:w16du="http://schemas.microsoft.com/office/word/2023/wordml/word16du" xmlns:w16sdtdh="http://schemas.microsoft.com/office/word/2020/wordml/sdtdatahash" xmlns:w16sdtfl="http://schemas.microsoft.com/office/word/2024/wordml/sdtformatlock" xmlns:w16se="http://schemas.microsoft.com/office/word/2015/wordml/symex" mc:Ignorable="w14 w15 w16se w16cid w16 w16cex w16sdtdh w16sdtfl w16du">
+<w:styles xmlns:mc="http://schemas.openxmlformats.org/markup-compatibility/2006" xmlns:r="http://schemas.openxmlformats.org/officeDocument/2006/relationships" xmlns:w="http://schemas.openxmlformats.org/wordprocessingml/2006/main" xmlns:w14="http://schemas.microsoft.com/office/word/2010/wordml" xmlns:w15="http://schemas.microsoft.com/office/word/2012/wordml" xmlns:w16se="http://schemas.microsoft.com/office/word/2015/wordml/symex" mc:Ignorable="w14 w15 w16se">
   <w:docDefaults>
     <w:rPrDefault>
       <w:rPr>
@@ -609,7 +960,7 @@
       </w:pPr>
     </w:pPrDefault>
   </w:docDefaults>
-  <w:latentStyles w:defLockedState="0" w:defUIPriority="99" w:defSemiHidden="0" w:defUnhideWhenUsed="0" w:defQFormat="0" w:count="376">
+  <w:latentStyles w:defLockedState="0" w:defUIPriority="99" w:defSemiHidden="0" w:defUnhideWhenUsed="0" w:defQFormat="0" w:count="371">
     <w:lsdException w:name="Normal" w:uiPriority="0" w:qFormat="1"/>
     <w:lsdException w:name="heading 1" w:uiPriority="9" w:qFormat="1"/>
     <w:lsdException w:name="heading 2" w:semiHidden="1" w:uiPriority="9" w:unhideWhenUsed="1" w:qFormat="1"/>
@@ -972,11 +1323,6 @@
     <w:lsdException w:name="List Table 5 Dark Accent 6" w:uiPriority="50"/>
     <w:lsdException w:name="List Table 6 Colorful Accent 6" w:uiPriority="51"/>
     <w:lsdException w:name="List Table 7 Colorful Accent 6" w:uiPriority="52"/>
-    <w:lsdException w:name="Mention" w:semiHidden="1" w:unhideWhenUsed="1"/>
-    <w:lsdException w:name="Smart Hyperlink" w:semiHidden="1" w:unhideWhenUsed="1"/>
-    <w:lsdException w:name="Hashtag" w:semiHidden="1" w:unhideWhenUsed="1"/>
-    <w:lsdException w:name="Unresolved Mention" w:semiHidden="1" w:unhideWhenUsed="1"/>
-    <w:lsdException w:name="Smart Link" w:semiHidden="1" w:unhideWhenUsed="1"/>
   </w:latentStyles>
   <w:style w:type="paragraph" w:default="1" w:styleId="Normal">
     <w:name w:val="Normal"/>
@@ -12300,7 +12646,7 @@
 </file>
 
 <file path=customXml/itemProps1.xml><?xml version="1.0" encoding="utf-8"?>
-<ds:datastoreItem xmlns:ds="http://schemas.openxmlformats.org/officeDocument/2006/customXml" ds:itemID="{EF278816-EC6F-A645-907D-7F25AECB1D4A}">
+<ds:datastoreItem xmlns:ds="http://schemas.openxmlformats.org/officeDocument/2006/customXml" ds:itemID="{E4BB5FB6-B22F-476B-AE44-81D81BE4EE07}">
   <ds:schemaRefs>
     <ds:schemaRef ds:uri="http://schemas.openxmlformats.org/officeDocument/2006/bibliography"/>
   </ds:schemaRefs>

</xml_diff>

<commit_message>
feat: implementa identidade institucional dinâmica em DOCX e PDF
</commit_message>
<xml_diff>
--- a/backend/pdf/modelo-notificacao-dinamico.docx
+++ b/backend/pdf/modelo-notificacao-dinamico.docx
@@ -4,65 +4,13 @@
   <w:body>
     <w:p>
       <w:pPr>
-        <w:jc w:val="center"/>
+        <w:rPr>
+          <w:u w:val="single"/>
+        </w:rPr>
       </w:pPr>
-      <w:r>
-        <w:rPr>
-          <w:b/>
-          <w:sz w:val="28"/>
-        </w:rPr>
-        <w:t>{{</w:t>
-      </w:r>
-      <w:proofErr w:type="spellStart"/>
-      <w:proofErr w:type="gramStart"/>
-      <w:r>
-        <w:rPr>
-          <w:b/>
-          <w:sz w:val="28"/>
-        </w:rPr>
-        <w:t>cabecalho</w:t>
-      </w:r>
-      <w:proofErr w:type="spellEnd"/>
-      <w:proofErr w:type="gramEnd"/>
-      <w:r>
-        <w:rPr>
-          <w:b/>
-          <w:sz w:val="28"/>
-        </w:rPr>
-        <w:t>}}</w:t>
-      </w:r>
+      <w:bookmarkStart w:id="0" w:name="_GoBack"/>
+      <w:bookmarkEnd w:id="0"/>
     </w:p>
-    <w:p>
-      <w:pPr>
-        <w:jc w:val="center"/>
-      </w:pPr>
-      <w:r>
-        <w:rPr>
-          <w:b/>
-          <w:sz w:val="24"/>
-        </w:rPr>
-        <w:t>{{</w:t>
-      </w:r>
-      <w:proofErr w:type="spellStart"/>
-      <w:proofErr w:type="gramStart"/>
-      <w:r>
-        <w:rPr>
-          <w:b/>
-          <w:sz w:val="24"/>
-        </w:rPr>
-        <w:t>regulamentoNome</w:t>
-      </w:r>
-      <w:proofErr w:type="spellEnd"/>
-      <w:proofErr w:type="gramEnd"/>
-      <w:r>
-        <w:rPr>
-          <w:b/>
-          <w:sz w:val="24"/>
-        </w:rPr>
-        <w:t>}}</w:t>
-      </w:r>
-    </w:p>
-    <w:p/>
     <w:p>
       <w:pPr>
         <w:jc w:val="center"/>
@@ -546,7 +494,6 @@
           <w:b/>
           <w:sz w:val="24"/>
         </w:rPr>
-        <w:lastRenderedPageBreak/>
         <w:t>Justificativa</w:t>
       </w:r>
       <w:proofErr w:type="spellEnd"/>
@@ -569,6 +516,7 @@
     </w:p>
     <w:p>
       <w:r>
+        <w:lastRenderedPageBreak/>
         <w:t>________________________________________________________</w:t>
       </w:r>
       <w:r>
@@ -697,8 +645,6 @@
       <w:pPr>
         <w:jc w:val="right"/>
       </w:pPr>
-      <w:bookmarkStart w:id="0" w:name="_GoBack"/>
-      <w:bookmarkEnd w:id="0"/>
       <w:proofErr w:type="spellStart"/>
       <w:r>
         <w:t>Cruzeiro</w:t>
@@ -12646,7 +12592,7 @@
 </file>
 
 <file path=customXml/itemProps1.xml><?xml version="1.0" encoding="utf-8"?>
-<ds:datastoreItem xmlns:ds="http://schemas.openxmlformats.org/officeDocument/2006/customXml" ds:itemID="{E4BB5FB6-B22F-476B-AE44-81D81BE4EE07}">
+<ds:datastoreItem xmlns:ds="http://schemas.openxmlformats.org/officeDocument/2006/customXml" ds:itemID="{0A3B6446-99AE-46D5-BBD1-48886635B5D3}">
   <ds:schemaRefs>
     <ds:schemaRef ds:uri="http://schemas.openxmlformats.org/officeDocument/2006/bibliography"/>
   </ds:schemaRefs>

</xml_diff>

<commit_message>
feat(redacao): adiciona sistema inteligente ENEM e atualiza templates institucionais DOCX
</commit_message>
<xml_diff>
--- a/backend/pdf/modelo-notificacao-dinamico.docx
+++ b/backend/pdf/modelo-notificacao-dinamico.docx
@@ -8,8 +8,6 @@
           <w:u w:val="single"/>
         </w:rPr>
       </w:pPr>
-      <w:bookmarkStart w:id="0" w:name="_GoBack"/>
-      <w:bookmarkEnd w:id="0"/>
     </w:p>
     <w:p>
       <w:pPr>
@@ -468,7 +466,6 @@
         <w:t>{{</w:t>
       </w:r>
       <w:proofErr w:type="spellStart"/>
-      <w:proofErr w:type="gramStart"/>
       <w:r>
         <w:rPr>
           <w:sz w:val="24"/>
@@ -476,7 +473,6 @@
         <w:t>fraseFinal</w:t>
       </w:r>
       <w:proofErr w:type="spellEnd"/>
-      <w:proofErr w:type="gramEnd"/>
       <w:r>
         <w:rPr>
           <w:sz w:val="24"/>
@@ -563,118 +559,8 @@
         <w:spacing w:after="0"/>
         <w:jc w:val="center"/>
       </w:pPr>
-    </w:p>
-    <w:p>
-      <w:pPr>
-        <w:spacing w:after="0"/>
-        <w:jc w:val="center"/>
-      </w:pPr>
-    </w:p>
-    <w:p>
-      <w:pPr>
-        <w:spacing w:after="0"/>
-        <w:jc w:val="center"/>
-      </w:pPr>
-    </w:p>
-    <w:p>
-      <w:pPr>
-        <w:spacing w:after="0"/>
-        <w:jc w:val="center"/>
-      </w:pPr>
-    </w:p>
-    <w:p>
-      <w:pPr>
-        <w:spacing w:after="0"/>
-        <w:jc w:val="center"/>
-      </w:pPr>
-    </w:p>
-    <w:p>
-      <w:pPr>
-        <w:spacing w:after="0"/>
-        <w:jc w:val="center"/>
-      </w:pPr>
-    </w:p>
-    <w:p>
-      <w:pPr>
-        <w:spacing w:after="0"/>
-        <w:jc w:val="center"/>
-      </w:pPr>
-    </w:p>
-    <w:p>
-      <w:pPr>
-        <w:spacing w:after="0"/>
-        <w:jc w:val="center"/>
-      </w:pPr>
-      <w:r>
-        <w:t>________________________________________________________________</w:t>
-      </w:r>
-    </w:p>
-    <w:p>
-      <w:pPr>
-        <w:spacing w:after="0"/>
-        <w:jc w:val="center"/>
-      </w:pPr>
-      <w:proofErr w:type="spellStart"/>
-      <w:r>
-        <w:t>Assinatura</w:t>
-      </w:r>
-      <w:proofErr w:type="spellEnd"/>
-      <w:r>
-        <w:t xml:space="preserve"> </w:t>
-      </w:r>
-      <w:proofErr w:type="spellStart"/>
-      <w:r>
-        <w:t>Coordenador</w:t>
-      </w:r>
-      <w:proofErr w:type="spellEnd"/>
-      <w:r>
-        <w:t xml:space="preserve"> de </w:t>
-      </w:r>
-      <w:proofErr w:type="spellStart"/>
-      <w:r>
-        <w:t>Turno</w:t>
-      </w:r>
-      <w:proofErr w:type="spellEnd"/>
-    </w:p>
-    <w:p>
-      <w:pPr>
-        <w:jc w:val="right"/>
-      </w:pPr>
-    </w:p>
-    <w:p>
-      <w:pPr>
-        <w:jc w:val="right"/>
-      </w:pPr>
-      <w:proofErr w:type="spellStart"/>
-      <w:r>
-        <w:t>Cruzeiro</w:t>
-      </w:r>
-      <w:proofErr w:type="spellEnd"/>
-      <w:r>
-        <w:t xml:space="preserve"> do </w:t>
-      </w:r>
-      <w:proofErr w:type="spellStart"/>
-      <w:r>
-        <w:t>Sul</w:t>
-      </w:r>
-      <w:proofErr w:type="spellEnd"/>
-      <w:r>
-        <w:t xml:space="preserve"> – </w:t>
-      </w:r>
-      <w:r>
-        <w:t>Acre</w:t>
-      </w:r>
-      <w:r>
-        <w:t>, {{</w:t>
-      </w:r>
-      <w:proofErr w:type="spellStart"/>
-      <w:r>
-        <w:t>dataHora</w:t>
-      </w:r>
-      <w:proofErr w:type="spellEnd"/>
-      <w:r>
-        <w:t>}}</w:t>
-      </w:r>
+      <w:bookmarkStart w:id="0" w:name="_GoBack"/>
+      <w:bookmarkEnd w:id="0"/>
     </w:p>
     <w:sectPr>
       <w:pgSz w:w="12240" w:h="15840"/>
@@ -12592,7 +12478,7 @@
 </file>
 
 <file path=customXml/itemProps1.xml><?xml version="1.0" encoding="utf-8"?>
-<ds:datastoreItem xmlns:ds="http://schemas.openxmlformats.org/officeDocument/2006/customXml" ds:itemID="{0A3B6446-99AE-46D5-BBD1-48886635B5D3}">
+<ds:datastoreItem xmlns:ds="http://schemas.openxmlformats.org/officeDocument/2006/customXml" ds:itemID="{222A1844-8EEB-4765-9D7C-6B1EAE481CF1}">
   <ds:schemaRefs>
     <ds:schemaRef ds:uri="http://schemas.openxmlformats.org/officeDocument/2006/bibliography"/>
   </ds:schemaRefs>

</xml_diff>